<commit_message>
Regenerate draft_paper_ja.docx from the updated 90-record analysis
Rebuilds the Word export from the current draft_paper_ja.md content:
updated abstract (Japanese, English, and Japanese restatement), Section
6's keyness table and issue/vocabulary/Kingdon tables, Section 7's
speaker-level-decomposed discussion, Section 8's conclusion, and a new
dated entry in the closing editorial memo documenting this round of
changes.

Structurally validated (200 paragraphs, XSD schema check passed) via the
docx skill's validate.py, since LibreOffice headless PDF conversion
remains broken in this environment (same issue noted when the file was
first created) and a visual preview could not be produced.

Co-Authored-By: Claude Sonnet 5 <noreply@anthropic.com>
Claude-Session: https://claude.ai/code/session_01Hgsjh1eSNj2HnyE3spMHxL
</commit_message>
<xml_diff>
--- a/draft_paper_ja.docx
+++ b/draft_paper_ja.docx
@@ -72,7 +72,7 @@
           <w:sz w:val="22"/>
           <w:szCs w:val="22"/>
         </w:rPr>
-        <w:t xml:space="preserve">本稿は、日本・韓国・中国の政府および指導者が対外的に発信した歴史認識関連の公式英語文書29件(2020〜2026年の主軸28件+1995年の歴史的画期1件)を素材に、「記憶レジーム」という分析枠組みを提示する。歴史認識問題は単なる謝罪の有無や十分性の問題ではなく、各国が過去をどのように制度化し、誰に責任を負わせ、どのような言説で正当化するかという構造の問題である。全文の文脈的コーディングの結果、行為主体を明示する発話の比率は日本0%・韓国60%・中国100%と顕著な差があり、この差異は各国の記憶レジームの類型――日本=政策管理型、韓国=被害政治型、中国=主権・正統性型――と対応することを示す。本稿はこの3類型をKingdonの政策の窓モデルと接続することで、歴史認識問題がなぜ反復的に再燃するのかを説明する。</w:t>
+        <w:t xml:space="preserve">本稿は、日本・韓国・中国の政府および指導者が対外的に発信した歴史認識関連の公式英語文書91件(2020〜2026年の主軸90件+1995年の歴史的画期1件)を素材に、「記憶レジーム」という分析枠組みを提示する。歴史認識問題は単なる謝罪の有無や十分性の問題ではなく、各国が過去をどのように制度化し、誰に責任を負わせ、どのような言説で正当化するかという構造の問題である。全文の文脈的コーディングの結果、行為主体を明示する発話の比率は日本0%・韓国67%(欠損2件を除く)・中国87%と顕著な差があり、この差異は各国の記憶レジームの類型――日本=政策管理型、韓国=被害政治型、中国=主権・正統性型――と対応することを示す。ただし発話者レベル別に分解すると、韓国・中国いずれも、この高い比率を牽引しているのは外交部報道官等の実務レベルの発話であり(韓国91%、中国100%)、首脳自身の発話ではこの比率が大きく下がる(韓国43〜100%と政権により変動、中国はわずか20%)。本稿はこの3類型をKingdonの政策の窓モデルと接続することで、歴史認識問題がなぜ反復的に再燃するのかを説明するとともに、「国家の記憶レジーム」という語り方が実際には発話者レベルによって大きく条件づけられていることを示す。</w:t>
       </w:r>
     </w:p>
     <w:p>
@@ -331,7 +331,7 @@
           <w:sz w:val="22"/>
           <w:szCs w:val="22"/>
         </w:rPr>
-        <w:t xml:space="preserve">資料収集は国ごとに異なる手続きを採った。日本については、首相官邸(Kantei)の歴代内閣統治期ごとの声明アーカイブを起点として月次索引ページを再帰的に収集する方法によって、2020年から2025年の対象期間内の候補URLを1096件、網羅的に収集した(うち1081件を実際にダウンロード、キーワードフィルタ通過後746件)。外務省サイト(mofa.go.jp)はAkamai製WAFにより恒常的に接続不能であったため、首相官邸発信の文書に限定される。この746件のうち、本稿執筆時点で全文読解による文脈的コーディングを終えているのは10件で、残る736件は今後の課題として引き続きコーディングを進める。</w:t>
+        <w:t xml:space="preserve">資料収集は国ごとに異なる手続きを採った。日本については、首相官邸(Kantei)の歴代内閣統治期ごとの声明アーカイブを起点として月次索引ページを再帰的に収集する方法によって、2020年から2025年の対象期間内の候補URLを1096件、網羅的に収集した(うち1081件を実際にダウンロード、キーワードフィルタ通過後746件)。外務省サイト(mofa.go.jp)はAkamai製WAFにより恒常的に接続不能であったため、首相官邸発信の文書に限定される。この746件のうち、本稿執筆時点で全文読解による文脈的コーディングを終えているのは30件(近接キーワード探索を複数回実施し、当初の10件から段階的に拡張した)で、残る718件は今後の課題として引き続きコーディングを進める。</w:t>
       </w:r>
     </w:p>
     <w:p>
@@ -375,7 +375,87 @@
           <w:sz w:val="22"/>
           <w:szCs w:val="22"/>
         </w:rPr>
-        <w:t xml:space="preserve">したがって最終的なサンプルは、日本10件・韓国10件・中国8件、計28件の主軸(2020年から2026年半ばまで)に加え、別途1995年の村山談話を歴史的画期(landmark anchor)として1件加えた計29件である。日本の主軸候補群(746件)が同一期間・同一手続きで機械的に発見された母集団であるのに対し、韓国・中国の候補群は、上記の技術的制約のもとで発見しえた文書の全件であり、日本と同水準の意味での母集団代表性は持たない。この非対称性は、量的な代表性の主張によってではなく、比較政治学における構造化・焦点化比較(structured, focused comparison)の枠組みによって正当化する。すなわち、三国それぞれについて同一の争点群・同一のコーディング枠組みを一貫して適用したうえで、各国を代表する事例(首脳による年次式典演説、外交当局者による定例会見等、公的性格の強い発話形式)を優先的に選定することで、量的な網羅性ではなく、事例選定の一貫性と比較可能性を担保する設計とした。</w:t>
+        <w:t xml:space="preserve">この初回の発見作業の時点でのサンプルは、日本10件・韓国10件・中国8件、計28件の主軸に加え、1995年の村山談話を歴史的画期(landmark anchor)として1件加えた計29件であった。その後、日本については上記の候補群(746件)への追加的な近接キーワード探索を、韓国・中国についてはそれぞれ新たな発見経路(韓国は</w:t>
+      </w:r>
+      <w:r>
+        <w:rPr>
+          <w:rFonts w:ascii="Consolas" w:cs="Consolas" w:eastAsia="Consolas" w:hAnsi="Consolas"/>
+          <w:sz w:val="20"/>
+          <w:szCs w:val="20"/>
+        </w:rPr>
+        <w:t xml:space="preserve">eng.president.go.kr/speeches/*</w:t>
+      </w:r>
+      <w:r>
+        <w:rPr>
+          <w:rFonts w:ascii="MS Mincho" w:cs="MS Mincho" w:eastAsia="MS Mincho" w:hAnsi="MS Mincho"/>
+          <w:sz w:val="22"/>
+          <w:szCs w:val="22"/>
+        </w:rPr>
+        <w:t xml:space="preserve">パスと韓国外務省の教科書検定・靖国関連声明の年次系列、中国は英語版新華社・国務院ニュースアーカイブ上の南京事件・9月18日事変・7月7日事変の年次追悼報道、および習近平・日本首相間のAPEC首脳会談記録)を開拓することで、主軸サンプルを日本・韓国・中国各30件、計90件まで拡張した(発見経路の詳細は</w:t>
+      </w:r>
+      <w:r>
+        <w:rPr>
+          <w:rFonts w:ascii="Consolas" w:cs="Consolas" w:eastAsia="Consolas" w:hAnsi="Consolas"/>
+          <w:sz w:val="20"/>
+          <w:szCs w:val="20"/>
+        </w:rPr>
+        <w:t xml:space="preserve">phase2_plan.md</w:t>
+      </w:r>
+      <w:r>
+        <w:rPr>
+          <w:rFonts w:ascii="MS Mincho" w:cs="MS Mincho" w:eastAsia="MS Mincho" w:hAnsi="MS Mincho"/>
+          <w:sz w:val="22"/>
+          <w:szCs w:val="22"/>
+        </w:rPr>
+        <w:t xml:space="preserve">を参照)。したがって本稿最終的なサンプルは、主軸90件+歴史的画期1件、計91件である。日本の主軸候補群(746件)が同一期間・同一手続きで機械的に発見された母集団であるのに対し、韓国・中国の候補群は、上記の技術的制約のもとで複数の発見経路を組み合わせて見出しえた文書の集積であり、日本と同水準の意味での母集団代表性は持たない。この非対称性は、量的な代表性の主張によってではなく、比較政治学における構造化・焦点化比較(structured, focused comparison)の枠組みによって正当化する。すなわち、三国それぞれについて同一の争点群・同一のコーディング枠組みを一貫して適用したうえで、各国を代表する事例(首脳による年次式典演説、外交当局者による定例会見・声明、国営メディアによる年次追悼報道等、公的性格の強い発話形式)を優先的に選定することで、量的な網羅性ではなく、事例選定の一貫性と比較可能性を担保する設計とした。韓国・中国のうち一部の記録は、当該政府の一次資料ページへの直接アクセスが繰り返し失敗した場合に限り、その一次資料の内容を直接かつ詳細に引用する通信社報道(新華社、聯合ニュース経由のKorea Times/Korea Herald等)を情報源としている――該当する各記録の</w:t>
+      </w:r>
+      <w:r>
+        <w:rPr>
+          <w:rFonts w:ascii="Consolas" w:cs="Consolas" w:eastAsia="Consolas" w:hAnsi="Consolas"/>
+          <w:sz w:val="20"/>
+          <w:szCs w:val="20"/>
+        </w:rPr>
+        <w:t xml:space="preserve">coder_notes</w:t>
+      </w:r>
+      <w:r>
+        <w:rPr>
+          <w:rFonts w:ascii="MS Mincho" w:cs="MS Mincho" w:eastAsia="MS Mincho" w:hAnsi="MS Mincho"/>
+          <w:sz w:val="22"/>
+          <w:szCs w:val="22"/>
+        </w:rPr>
+        <w:t xml:space="preserve">にその旨明記し、</w:t>
+      </w:r>
+      <w:r>
+        <w:rPr>
+          <w:rFonts w:ascii="Consolas" w:cs="Consolas" w:eastAsia="Consolas" w:hAnsi="Consolas"/>
+          <w:sz w:val="20"/>
+          <w:szCs w:val="20"/>
+        </w:rPr>
+        <w:t xml:space="preserve">classification_confidence</w:t>
+      </w:r>
+      <w:r>
+        <w:rPr>
+          <w:rFonts w:ascii="MS Mincho" w:cs="MS Mincho" w:eastAsia="MS Mincho" w:hAnsi="MS Mincho"/>
+          <w:sz w:val="22"/>
+          <w:szCs w:val="22"/>
+        </w:rPr>
+        <w:t xml:space="preserve">を</w:t>
+      </w:r>
+      <w:r>
+        <w:rPr>
+          <w:rFonts w:ascii="Consolas" w:cs="Consolas" w:eastAsia="Consolas" w:hAnsi="Consolas"/>
+          <w:sz w:val="20"/>
+          <w:szCs w:val="20"/>
+        </w:rPr>
+        <w:t xml:space="preserve">MEDIUM</w:t>
+      </w:r>
+      <w:r>
+        <w:rPr>
+          <w:rFonts w:ascii="MS Mincho" w:cs="MS Mincho" w:eastAsia="MS Mincho" w:hAnsi="MS Mincho"/>
+          <w:sz w:val="22"/>
+          <w:szCs w:val="22"/>
+        </w:rPr>
+        <w:t xml:space="preserve">に格下げしている。</w:t>
       </w:r>
     </w:p>
     <w:p>
@@ -482,6 +562,20 @@
     </w:p>
     <w:p>
       <w:pPr>
+        <w:spacing w:after="200" w:line="320"/>
+        <w:jc w:val="both"/>
+      </w:pPr>
+      <w:r>
+        <w:rPr>
+          <w:rFonts w:ascii="MS Mincho" w:cs="MS Mincho" w:eastAsia="MS Mincho" w:hAnsi="MS Mincho"/>
+          <w:sz w:val="22"/>
+          <w:szCs w:val="22"/>
+        </w:rPr>
+        <w:t xml:space="preserve">本節の数値はすべて、30/30/30(日本・韓国・中国各30件、計90件)へと拡張した主軸サンプルに基づき改めて集計し直したものである(前回集計時点の28件からの変更点は、本節末尾の各所で注記する)。</w:t>
+      </w:r>
+    </w:p>
+    <w:p>
+      <w:pPr>
         <w:spacing w:after="120" w:before="200"/>
       </w:pPr>
       <w:r>
@@ -506,7 +600,7 @@
           <w:sz w:val="22"/>
           <w:szCs w:val="22"/>
         </w:rPr>
-        <w:t xml:space="preserve">計量テキスト分析は、5節で述べた通り、文脈的コーディングによって得られた解釈を裏づける補助的根拠として用いる。以前の学会報告(2026年6月、日本法政学会)で提示した頻出語表は、本稿のコーパスとは異なる、より大規模な資料(2016年時点の演説データセット等)に基づくものであり、本稿の29件(コーディング済み全記録)には直接流用できない。そこで本稿では、29件の</w:t>
+        <w:t xml:space="preserve">計量テキスト分析は、5節で述べた通り、文脈的コーディングによって得られた解釈を裏づける補助的根拠として用いる。90件の</w:t>
       </w:r>
       <w:r>
         <w:rPr>
@@ -522,7 +616,7 @@
           <w:sz w:val="22"/>
           <w:szCs w:val="22"/>
         </w:rPr>
-        <w:t xml:space="preserve">(発話全文)を国別に結合し、対数尤度比(log-likelihood, LL)によるキーネス分析を改めて実施した。すなわち、ある語が特定の国のコーパスにおいて、他の二か国のコーパスと比べてどれだけ統計的に有意に高頻度で出現するかを算出したものである(語形は小文字化し、機能語を除去、出現数3未満の語は除外)。</w:t>
+        <w:t xml:space="preserve">(発話全文)を国別に結合し、対数尤度比(log-likelihood, LL)によるキーネス分析を実施した。すなわち、ある語が特定の国のコーパスにおいて、他の二か国のコーパスと比べてどれだけ統計的に有意に高頻度で出現するかを算出したものである(語形は小文字化し、機能語を除去、出現数3未満の語は除外)。</w:t>
       </w:r>
     </w:p>
     <w:tbl>
@@ -599,7 +693,7 @@
                 <w:sz w:val="20"/>
                 <w:szCs w:val="20"/>
               </w:rPr>
-              <w:t xml:space="preserve">日本(総語数3,221)</w:t>
+              <w:t xml:space="preserve">日本(総語数8,419)</w:t>
             </w:r>
           </w:p>
         </w:tc>
@@ -655,7 +749,7 @@
                 <w:sz w:val="20"/>
                 <w:szCs w:val="20"/>
               </w:rPr>
-              <w:t xml:space="preserve">韓国(総語数7,610)</w:t>
+              <w:t xml:space="preserve">韓国(総語数9,392)</w:t>
             </w:r>
           </w:p>
         </w:tc>
@@ -711,7 +805,7 @@
                 <w:sz w:val="20"/>
                 <w:szCs w:val="20"/>
               </w:rPr>
-              <w:t xml:space="preserve">中国(総語数1,735)</w:t>
+              <w:t xml:space="preserve">中国(総語数3,836)</w:t>
             </w:r>
           </w:p>
         </w:tc>
@@ -795,7 +889,7 @@
                 <w:sz w:val="20"/>
                 <w:szCs w:val="20"/>
               </w:rPr>
-              <w:t xml:space="preserve">prime</w:t>
+              <w:t xml:space="preserve">atomic</w:t>
             </w:r>
           </w:p>
         </w:tc>
@@ -822,7 +916,7 @@
                 <w:sz w:val="20"/>
                 <w:szCs w:val="20"/>
               </w:rPr>
-              <w:t xml:space="preserve">209.1</w:t>
+              <w:t xml:space="preserve">294.8</w:t>
             </w:r>
           </w:p>
         </w:tc>
@@ -876,7 +970,7 @@
                 <w:sz w:val="20"/>
                 <w:szCs w:val="20"/>
               </w:rPr>
-              <w:t xml:space="preserve">91.3</w:t>
+              <w:t xml:space="preserve">193.3</w:t>
             </w:r>
           </w:p>
         </w:tc>
@@ -903,7 +997,7 @@
                 <w:sz w:val="20"/>
                 <w:szCs w:val="20"/>
               </w:rPr>
-              <w:t xml:space="preserve">chinese</w:t>
+              <w:t xml:space="preserve">china</w:t>
             </w:r>
           </w:p>
         </w:tc>
@@ -930,7 +1024,7 @@
                 <w:sz w:val="20"/>
                 <w:szCs w:val="20"/>
               </w:rPr>
-              <w:t xml:space="preserve">130.7</w:t>
+              <w:t xml:space="preserve">211.2</w:t>
             </w:r>
           </w:p>
         </w:tc>
@@ -986,7 +1080,7 @@
                 <w:sz w:val="20"/>
                 <w:szCs w:val="20"/>
               </w:rPr>
-              <w:t xml:space="preserve">minister</w:t>
+              <w:t xml:space="preserve">nuclear</w:t>
             </w:r>
           </w:p>
         </w:tc>
@@ -1013,7 +1107,7 @@
                 <w:sz w:val="20"/>
                 <w:szCs w:val="20"/>
               </w:rPr>
-              <w:t xml:space="preserve">169.7</w:t>
+              <w:t xml:space="preserve">270.9</w:t>
             </w:r>
           </w:p>
         </w:tc>
@@ -1067,7 +1161,7 @@
                 <w:sz w:val="20"/>
                 <w:szCs w:val="20"/>
               </w:rPr>
-              <w:t xml:space="preserve">88.3</w:t>
+              <w:t xml:space="preserve">140.4</w:t>
             </w:r>
           </w:p>
         </w:tc>
@@ -1094,7 +1188,7 @@
                 <w:sz w:val="20"/>
                 <w:szCs w:val="20"/>
               </w:rPr>
-              <w:t xml:space="preserve">aggression</w:t>
+              <w:t xml:space="preserve">chinese</w:t>
             </w:r>
           </w:p>
         </w:tc>
@@ -1121,7 +1215,7 @@
                 <w:sz w:val="20"/>
                 <w:szCs w:val="20"/>
               </w:rPr>
-              <w:t xml:space="preserve">110.9</w:t>
+              <w:t xml:space="preserve">207.7</w:t>
             </w:r>
           </w:p>
         </w:tc>
@@ -1177,7 +1271,7 @@
                 <w:sz w:val="20"/>
                 <w:szCs w:val="20"/>
               </w:rPr>
-              <w:t xml:space="preserve">dead</w:t>
+              <w:t xml:space="preserve">bomb</w:t>
             </w:r>
           </w:p>
         </w:tc>
@@ -1204,7 +1298,7 @@
                 <w:sz w:val="20"/>
                 <w:szCs w:val="20"/>
               </w:rPr>
-              <w:t xml:space="preserve">126.9</w:t>
+              <w:t xml:space="preserve">188.9</w:t>
             </w:r>
           </w:p>
         </w:tc>
@@ -1258,7 +1352,7 @@
                 <w:sz w:val="20"/>
                 <w:szCs w:val="20"/>
               </w:rPr>
-              <w:t xml:space="preserve">53.8</w:t>
+              <w:t xml:space="preserve">99.3</w:t>
             </w:r>
           </w:p>
         </w:tc>
@@ -1285,7 +1379,7 @@
                 <w:sz w:val="20"/>
                 <w:szCs w:val="20"/>
               </w:rPr>
-              <w:t xml:space="preserve">china</w:t>
+              <w:t xml:space="preserve">aggression</w:t>
             </w:r>
           </w:p>
         </w:tc>
@@ -1312,7 +1406,7 @@
                 <w:sz w:val="20"/>
                 <w:szCs w:val="20"/>
               </w:rPr>
-              <w:t xml:space="preserve">108.3</w:t>
+              <w:t xml:space="preserve">144.8</w:t>
             </w:r>
           </w:p>
         </w:tc>
@@ -1368,7 +1462,7 @@
                 <w:sz w:val="20"/>
                 <w:szCs w:val="20"/>
               </w:rPr>
-              <w:t xml:space="preserve">rok</w:t>
+              <w:t xml:space="preserve">weapons</w:t>
             </w:r>
           </w:p>
         </w:tc>
@@ -1395,7 +1489,7 @@
                 <w:sz w:val="20"/>
                 <w:szCs w:val="20"/>
               </w:rPr>
-              <w:t xml:space="preserve">89.1</w:t>
+              <w:t xml:space="preserve">150.8</w:t>
             </w:r>
           </w:p>
         </w:tc>
@@ -1422,7 +1516,7 @@
                 <w:sz w:val="20"/>
                 <w:szCs w:val="20"/>
               </w:rPr>
-              <w:t xml:space="preserve">koreans</w:t>
+              <w:t xml:space="preserve">korean</w:t>
             </w:r>
           </w:p>
         </w:tc>
@@ -1449,7 +1543,7 @@
                 <w:sz w:val="20"/>
                 <w:szCs w:val="20"/>
               </w:rPr>
-              <w:t xml:space="preserve">43.1</w:t>
+              <w:t xml:space="preserve">81.9</w:t>
             </w:r>
           </w:p>
         </w:tc>
@@ -1476,7 +1570,7 @@
                 <w:sz w:val="20"/>
                 <w:szCs w:val="20"/>
               </w:rPr>
-              <w:t xml:space="preserve">japanese</w:t>
+              <w:t xml:space="preserve">nanjing</w:t>
             </w:r>
           </w:p>
         </w:tc>
@@ -1503,7 +1597,7 @@
                 <w:sz w:val="20"/>
                 <w:szCs w:val="20"/>
               </w:rPr>
-              <w:t xml:space="preserve">59.8</w:t>
+              <w:t xml:space="preserve">124.6</w:t>
             </w:r>
           </w:p>
         </w:tc>
@@ -1559,7 +1653,7 @@
                 <w:sz w:val="20"/>
                 <w:szCs w:val="20"/>
               </w:rPr>
-              <w:t xml:space="preserve">war</w:t>
+              <w:t xml:space="preserve">prime</w:t>
             </w:r>
           </w:p>
         </w:tc>
@@ -1586,7 +1680,7 @@
                 <w:sz w:val="20"/>
                 <w:szCs w:val="20"/>
               </w:rPr>
-              <w:t xml:space="preserve">77.8</w:t>
+              <w:t xml:space="preserve">147.2</w:t>
             </w:r>
           </w:p>
         </w:tc>
@@ -1613,7 +1707,7 @@
                 <w:sz w:val="20"/>
                 <w:szCs w:val="20"/>
               </w:rPr>
-              <w:t xml:space="preserve">korean</w:t>
+              <w:t xml:space="preserve">liberation</w:t>
             </w:r>
           </w:p>
         </w:tc>
@@ -1640,7 +1734,7 @@
                 <w:sz w:val="20"/>
                 <w:szCs w:val="20"/>
               </w:rPr>
-              <w:t xml:space="preserve">40.2</w:t>
+              <w:t xml:space="preserve">65</w:t>
             </w:r>
           </w:p>
         </w:tc>
@@ -1667,7 +1761,7 @@
                 <w:sz w:val="20"/>
                 <w:szCs w:val="20"/>
               </w:rPr>
-              <w:t xml:space="preserve">war</w:t>
+              <w:t xml:space="preserve">japanese</w:t>
             </w:r>
           </w:p>
         </w:tc>
@@ -1694,7 +1788,7 @@
                 <w:sz w:val="20"/>
                 <w:szCs w:val="20"/>
               </w:rPr>
-              <w:t xml:space="preserve">54.6</w:t>
+              <w:t xml:space="preserve">109.7</w:t>
             </w:r>
           </w:p>
         </w:tc>
@@ -1750,7 +1844,7 @@
                 <w:sz w:val="20"/>
                 <w:szCs w:val="20"/>
               </w:rPr>
-              <w:t xml:space="preserve">statements</w:t>
+              <w:t xml:space="preserve">hiroshima</w:t>
             </w:r>
           </w:p>
         </w:tc>
@@ -1777,7 +1871,7 @@
                 <w:sz w:val="20"/>
                 <w:szCs w:val="20"/>
               </w:rPr>
-              <w:t xml:space="preserve">73.5</w:t>
+              <w:t xml:space="preserve">109.7</w:t>
             </w:r>
           </w:p>
         </w:tc>
@@ -1804,7 +1898,7 @@
                 <w:sz w:val="20"/>
                 <w:szCs w:val="20"/>
               </w:rPr>
-              <w:t xml:space="preserve">day</w:t>
+              <w:t xml:space="preserve">koreans</w:t>
             </w:r>
           </w:p>
         </w:tc>
@@ -1831,7 +1925,7 @@
                 <w:sz w:val="20"/>
                 <w:szCs w:val="20"/>
               </w:rPr>
-              <w:t xml:space="preserve">36.1</w:t>
+              <w:t xml:space="preserve">63.4</w:t>
             </w:r>
           </w:p>
         </w:tc>
@@ -1858,7 +1952,7 @@
                 <w:sz w:val="20"/>
                 <w:szCs w:val="20"/>
               </w:rPr>
-              <w:t xml:space="preserve">resistance</w:t>
+              <w:t xml:space="preserve">war</w:t>
             </w:r>
           </w:p>
         </w:tc>
@@ -1885,7 +1979,7 @@
                 <w:sz w:val="20"/>
                 <w:szCs w:val="20"/>
               </w:rPr>
-              <w:t xml:space="preserve">52.2</w:t>
+              <w:t xml:space="preserve">102.4</w:t>
             </w:r>
           </w:p>
         </w:tc>
@@ -1941,7 +2035,7 @@
                 <w:sz w:val="20"/>
                 <w:szCs w:val="20"/>
               </w:rPr>
-              <w:t xml:space="preserve">japan</w:t>
+              <w:t xml:space="preserve">minister</w:t>
             </w:r>
           </w:p>
         </w:tc>
@@ -1968,7 +2062,7 @@
                 <w:sz w:val="20"/>
                 <w:szCs w:val="20"/>
               </w:rPr>
-              <w:t xml:space="preserve">66.8</w:t>
+              <w:t xml:space="preserve">108.1</w:t>
             </w:r>
           </w:p>
         </w:tc>
@@ -1995,7 +2089,7 @@
                 <w:sz w:val="20"/>
                 <w:szCs w:val="20"/>
               </w:rPr>
-              <w:t xml:space="preserve">liberation</w:t>
+              <w:t xml:space="preserve">government</w:t>
             </w:r>
           </w:p>
         </w:tc>
@@ -2022,7 +2116,7 @@
                 <w:sz w:val="20"/>
                 <w:szCs w:val="20"/>
               </w:rPr>
-              <w:t xml:space="preserve">34.5</w:t>
+              <w:t xml:space="preserve">57.2</w:t>
             </w:r>
           </w:p>
         </w:tc>
@@ -2049,7 +2143,7 @@
                 <w:sz w:val="20"/>
                 <w:szCs w:val="20"/>
               </w:rPr>
-              <w:t xml:space="preserve">fascist</w:t>
+              <w:t xml:space="preserve">massacre</w:t>
             </w:r>
           </w:p>
         </w:tc>
@@ -2076,7 +2170,7 @@
                 <w:sz w:val="20"/>
                 <w:szCs w:val="20"/>
               </w:rPr>
-              <w:t xml:space="preserve">51.5</w:t>
+              <w:t xml:space="preserve">93.4</w:t>
             </w:r>
           </w:p>
         </w:tc>
@@ -2132,7 +2226,7 @@
                 <w:sz w:val="20"/>
                 <w:szCs w:val="20"/>
               </w:rPr>
-              <w:t xml:space="preserve">memorial</w:t>
+              <w:t xml:space="preserve">nagasaki</w:t>
             </w:r>
           </w:p>
         </w:tc>
@@ -2159,7 +2253,7 @@
                 <w:sz w:val="20"/>
                 <w:szCs w:val="20"/>
               </w:rPr>
-              <w:t xml:space="preserve">62.6</w:t>
+              <w:t xml:space="preserve">105.8</w:t>
             </w:r>
           </w:p>
         </w:tc>
@@ -2186,7 +2280,7 @@
                 <w:sz w:val="20"/>
                 <w:szCs w:val="20"/>
               </w:rPr>
-              <w:t xml:space="preserve">fellow</w:t>
+              <w:t xml:space="preserve">movement</w:t>
             </w:r>
           </w:p>
         </w:tc>
@@ -2213,7 +2307,7 @@
                 <w:sz w:val="20"/>
                 <w:szCs w:val="20"/>
               </w:rPr>
-              <w:t xml:space="preserve">32.1</w:t>
+              <w:t xml:space="preserve">51.8</w:t>
             </w:r>
           </w:p>
         </w:tc>
@@ -2240,7 +2334,7 @@
                 <w:sz w:val="20"/>
                 <w:szCs w:val="20"/>
               </w:rPr>
-              <w:t xml:space="preserve">victory</w:t>
+              <w:t xml:space="preserve">shrine</w:t>
             </w:r>
           </w:p>
         </w:tc>
@@ -2267,7 +2361,7 @@
                 <w:sz w:val="20"/>
                 <w:szCs w:val="20"/>
               </w:rPr>
-              <w:t xml:space="preserve">44.6</w:t>
+              <w:t xml:space="preserve">88.2</w:t>
             </w:r>
           </w:p>
         </w:tc>
@@ -2323,7 +2417,7 @@
                 <w:sz w:val="20"/>
                 <w:szCs w:val="20"/>
               </w:rPr>
-              <w:t xml:space="preserve">cabinet</w:t>
+              <w:t xml:space="preserve">dead</w:t>
             </w:r>
           </w:p>
         </w:tc>
@@ -2350,7 +2444,7 @@
                 <w:sz w:val="20"/>
                 <w:szCs w:val="20"/>
               </w:rPr>
-              <w:t xml:space="preserve">52.3</w:t>
+              <w:t xml:space="preserve">85.6</w:t>
             </w:r>
           </w:p>
         </w:tc>
@@ -2404,7 +2498,7 @@
                 <w:sz w:val="20"/>
                 <w:szCs w:val="20"/>
               </w:rPr>
-              <w:t xml:space="preserve">31.8</w:t>
+              <w:t xml:space="preserve">50.4</w:t>
             </w:r>
           </w:p>
         </w:tc>
@@ -2431,7 +2525,7 @@
                 <w:sz w:val="20"/>
                 <w:szCs w:val="20"/>
               </w:rPr>
-              <w:t xml:space="preserve">yasukuni/shrine</w:t>
+              <w:t xml:space="preserve">resistance</w:t>
             </w:r>
           </w:p>
         </w:tc>
@@ -2458,7 +2552,7 @@
                 <w:sz w:val="20"/>
                 <w:szCs w:val="20"/>
               </w:rPr>
-              <w:t xml:space="preserve">43.6</w:t>
+              <w:t xml:space="preserve">75.1</w:t>
             </w:r>
           </w:p>
         </w:tc>
@@ -2514,7 +2608,7 @@
                 <w:sz w:val="20"/>
                 <w:szCs w:val="20"/>
               </w:rPr>
-              <w:t xml:space="preserve">heartfelt</w:t>
+              <w:t xml:space="preserve">disarmament</w:t>
             </w:r>
           </w:p>
         </w:tc>
@@ -2541,7 +2635,7 @@
                 <w:sz w:val="20"/>
                 <w:szCs w:val="20"/>
               </w:rPr>
-              <w:t xml:space="preserve">40.8</w:t>
+              <w:t xml:space="preserve">64.2</w:t>
             </w:r>
           </w:p>
         </w:tc>
@@ -2568,7 +2662,7 @@
                 <w:sz w:val="20"/>
                 <w:szCs w:val="20"/>
               </w:rPr>
-              <w:t xml:space="preserve">movement</w:t>
+              <w:t xml:space="preserve">unification</w:t>
             </w:r>
           </w:p>
         </w:tc>
@@ -2595,7 +2689,7 @@
                 <w:sz w:val="20"/>
                 <w:szCs w:val="20"/>
               </w:rPr>
-              <w:t xml:space="preserve">30.1</w:t>
+              <w:t xml:space="preserve">45.1</w:t>
             </w:r>
           </w:p>
         </w:tc>
@@ -2622,7 +2716,7 @@
                 <w:sz w:val="20"/>
                 <w:szCs w:val="20"/>
               </w:rPr>
-              <w:t xml:space="preserve">justice</w:t>
+              <w:t xml:space="preserve">yasukuni</w:t>
             </w:r>
           </w:p>
         </w:tc>
@@ -2649,7 +2743,7 @@
                 <w:sz w:val="20"/>
                 <w:szCs w:val="20"/>
               </w:rPr>
-              <w:t xml:space="preserve">31.7</w:t>
+              <w:t xml:space="preserve">65.4</w:t>
             </w:r>
           </w:p>
         </w:tc>
@@ -2671,7 +2765,7 @@
           <w:sz w:val="22"/>
           <w:szCs w:val="22"/>
         </w:rPr>
-        <w:t xml:space="preserve">各国上位語の性格は明確に異なる。日本の上位語(prime, minister, dead, memorial, cabinet, heartfelt)は、首相官邸発の儀礼的な追悼発話というジャンルそのものを反映しており、歴史認識の実質的争点語(aggression, colonial等)は上位に現れない。韓国の上位語(korea, freedom, independence, liberation, movement)は、独立運動・光復節という自国史ナラティブの語彙が支配的であり、対日関係語(japan, colonial等)は上位10語には入らない――これは、韓国の発話が「日本を名指しして問う」ことよりも「自国の独立史を物語る」ことに紙幅の大半を割いているという構成上の特徴であり、(二)で見る</w:t>
+        <w:t xml:space="preserve">30件への拡張は、この表を前回集計(28件、Japan10/Korea10/China8相当)から大きく組み替えた。とりわけ日本は、広島・長崎平和式典演説12件の追加によって、上位語が"atomic / nuclear / bomb / weapons / hiroshima / nagasaki / disarmament"という被爆・核軍縮語彙に一変している――これは、前回集計時に上位を占めていた"prime / minister / memorial / cabinet"的な儀礼ジャンル語彙が、より具体的な下位ジャンル(原爆式典)の語彙に置き換わったことを意味し、「日本の上位語は儀礼的ジャンルを反映する」という前回の解釈自体は覆らないものの、そのジャンルの中身がサンプル構成によって大きく変動しうることを示す一例である。韓国の上位語(korea, freedom, independence, liberation, koreans, movement, unification)は、独立運動・光復節という自国史ナラティブの語彙が引き続き支配的であり、対日関係語は上位10語には入らない――これは、韓国の発話量の多くが「日本を名指しして問う」ことよりも「自国の独立史を物語る」ことに割かれているという構成上の特徴であり、(三)で見る</w:t>
       </w:r>
       <w:r>
         <w:rPr>
@@ -2687,23 +2781,7 @@
           <w:sz w:val="22"/>
           <w:szCs w:val="22"/>
         </w:rPr>
-        <w:t xml:space="preserve">が60%と相対的に高いことと矛盾するものではない(残りの発話量のなかで、日本に言及する箇所では明示的な名指しが選好される、と解釈すべきである)。中国の上位語(chinese, aggression, china, japanese, resistance, fascist, victory, yasukuni, justice)は、対照的に、日本の歴史的責任を直接に問う語彙が上位を占めており、争点語そのものが高頻度語として現れる唯一の国である。この違いは、(二)(三)で見る</w:t>
-      </w:r>
-      <w:r>
-        <w:rPr>
-          <w:rFonts w:ascii="Consolas" w:cs="Consolas" w:eastAsia="Consolas" w:hAnsi="Consolas"/>
-          <w:sz w:val="20"/>
-          <w:szCs w:val="20"/>
-        </w:rPr>
-        <w:t xml:space="preserve">agency_explicit</w:t>
-      </w:r>
-      <w:r>
-        <w:rPr>
-          <w:rFonts w:ascii="MS Mincho" w:cs="MS Mincho" w:eastAsia="MS Mincho" w:hAnsi="MS Mincho"/>
-          <w:sz w:val="22"/>
-          <w:szCs w:val="22"/>
-        </w:rPr>
-        <w:t xml:space="preserve">・Kingdon政治次元の該当率が中国で最も高いことと整合的である。</w:t>
+        <w:t xml:space="preserve">の高さと矛盾するものではない。中国の上位語(china, chinese, aggression, nanjing, japanese, war, massacre, shrine, resistance, yasukuni)は、対照的に、日本の歴史的責任を直接に問う語彙・特定の歴史的事件名(nanjing, yasukuni)そのものが上位を占めており、争点語彙が高頻度語として現れる唯一の国である――この点は前回集計から一貫している。</w:t>
       </w:r>
     </w:p>
     <w:p>
@@ -2732,7 +2810,7 @@
           <w:sz w:val="22"/>
           <w:szCs w:val="22"/>
         </w:rPr>
-        <w:t xml:space="preserve">日本の10件は、</w:t>
+        <w:t xml:space="preserve">日本の30件は</w:t>
       </w:r>
       <w:r>
         <w:rPr>
@@ -2748,7 +2826,7 @@
           <w:sz w:val="22"/>
           <w:szCs w:val="22"/>
         </w:rPr>
-        <w:t xml:space="preserve">(戦争一般)6件、</w:t>
+        <w:t xml:space="preserve">(戦争一般)19件、</w:t>
       </w:r>
       <w:r>
         <w:rPr>
@@ -2764,7 +2842,23 @@
           <w:sz w:val="22"/>
           <w:szCs w:val="22"/>
         </w:rPr>
-        <w:t xml:space="preserve">(強制労働)2件、</w:t>
+        <w:t xml:space="preserve">(強制労働)9件、</w:t>
+      </w:r>
+      <w:r>
+        <w:rPr>
+          <w:rFonts w:ascii="Consolas" w:cs="Consolas" w:eastAsia="Consolas" w:hAnsi="Consolas"/>
+          <w:sz w:val="20"/>
+          <w:szCs w:val="20"/>
+        </w:rPr>
+        <w:t xml:space="preserve">HISTORICAL_RECOGNITION_GENERAL</w:t>
+      </w:r>
+      <w:r>
+        <w:rPr>
+          <w:rFonts w:ascii="MS Mincho" w:cs="MS Mincho" w:eastAsia="MS Mincho" w:hAnsi="MS Mincho"/>
+          <w:sz w:val="22"/>
+          <w:szCs w:val="22"/>
+        </w:rPr>
+        <w:t xml:space="preserve">(歴史認識一般)1件、</w:t>
       </w:r>
       <w:r>
         <w:rPr>
@@ -2780,23 +2874,7 @@
           <w:sz w:val="22"/>
           <w:szCs w:val="22"/>
         </w:rPr>
-        <w:t xml:space="preserve">(慰安婦)1件、</w:t>
-      </w:r>
-      <w:r>
-        <w:rPr>
-          <w:rFonts w:ascii="Consolas" w:cs="Consolas" w:eastAsia="Consolas" w:hAnsi="Consolas"/>
-          <w:sz w:val="20"/>
-          <w:szCs w:val="20"/>
-        </w:rPr>
-        <w:t xml:space="preserve">HISTORICAL_RECOGNITION_GENERAL</w:t>
-      </w:r>
-      <w:r>
-        <w:rPr>
-          <w:rFonts w:ascii="MS Mincho" w:cs="MS Mincho" w:eastAsia="MS Mincho" w:hAnsi="MS Mincho"/>
-          <w:sz w:val="22"/>
-          <w:szCs w:val="22"/>
-        </w:rPr>
-        <w:t xml:space="preserve">(歴史認識一般)1件で構成され、全件が首脳(</w:t>
+        <w:t xml:space="preserve">(慰安婦)1件で構成され、全件が首脳(</w:t>
       </w:r>
       <w:r>
         <w:rPr>
@@ -2812,151 +2890,23 @@
           <w:sz w:val="22"/>
           <w:szCs w:val="22"/>
         </w:rPr>
-        <w:t xml:space="preserve">)による発話である。韓国の10件は</w:t>
-      </w:r>
-      <w:r>
-        <w:rPr>
-          <w:rFonts w:ascii="Consolas" w:cs="Consolas" w:eastAsia="Consolas" w:hAnsi="Consolas"/>
-          <w:sz w:val="20"/>
-          <w:szCs w:val="20"/>
-        </w:rPr>
-        <w:t xml:space="preserve">HISTORICAL_RECOGNITION_GENERAL</w:t>
-      </w:r>
-      <w:r>
-        <w:rPr>
-          <w:rFonts w:ascii="MS Mincho" w:cs="MS Mincho" w:eastAsia="MS Mincho" w:hAnsi="MS Mincho"/>
-          <w:sz w:val="22"/>
-          <w:szCs w:val="22"/>
-        </w:rPr>
-        <w:t xml:space="preserve">5件、</w:t>
-      </w:r>
-      <w:r>
-        <w:rPr>
-          <w:rFonts w:ascii="Consolas" w:cs="Consolas" w:eastAsia="Consolas" w:hAnsi="Consolas"/>
-          <w:sz w:val="20"/>
-          <w:szCs w:val="20"/>
-        </w:rPr>
-        <w:t xml:space="preserve">FORCED_LABOR</w:t>
-      </w:r>
-      <w:r>
-        <w:rPr>
-          <w:rFonts w:ascii="MS Mincho" w:cs="MS Mincho" w:eastAsia="MS Mincho" w:hAnsi="MS Mincho"/>
-          <w:sz w:val="22"/>
-          <w:szCs w:val="22"/>
-        </w:rPr>
-        <w:t xml:space="preserve">2件、</w:t>
-      </w:r>
-      <w:r>
-        <w:rPr>
-          <w:rFonts w:ascii="Consolas" w:cs="Consolas" w:eastAsia="Consolas" w:hAnsi="Consolas"/>
-          <w:sz w:val="20"/>
-          <w:szCs w:val="20"/>
-        </w:rPr>
-        <w:t xml:space="preserve">COLONIAL_RULE</w:t>
-      </w:r>
-      <w:r>
-        <w:rPr>
-          <w:rFonts w:ascii="MS Mincho" w:cs="MS Mincho" w:eastAsia="MS Mincho" w:hAnsi="MS Mincho"/>
-          <w:sz w:val="22"/>
-          <w:szCs w:val="22"/>
-        </w:rPr>
-        <w:t xml:space="preserve">(植民地支配)2件、</w:t>
-      </w:r>
-      <w:r>
-        <w:rPr>
-          <w:rFonts w:ascii="Consolas" w:cs="Consolas" w:eastAsia="Consolas" w:hAnsi="Consolas"/>
-          <w:sz w:val="20"/>
-          <w:szCs w:val="20"/>
-        </w:rPr>
-        <w:t xml:space="preserve">COMFORT_WOMEN</w:t>
-      </w:r>
-      <w:r>
-        <w:rPr>
-          <w:rFonts w:ascii="MS Mincho" w:cs="MS Mincho" w:eastAsia="MS Mincho" w:hAnsi="MS Mincho"/>
-          <w:sz w:val="22"/>
-          <w:szCs w:val="22"/>
-        </w:rPr>
-        <w:t xml:space="preserve">1件で、こちらも全件が首脳による発話である。中国の8件は</w:t>
-      </w:r>
-      <w:r>
-        <w:rPr>
-          <w:rFonts w:ascii="Consolas" w:cs="Consolas" w:eastAsia="Consolas" w:hAnsi="Consolas"/>
-          <w:sz w:val="20"/>
-          <w:szCs w:val="20"/>
-        </w:rPr>
-        <w:t xml:space="preserve">YASUKUNI</w:t>
-      </w:r>
-      <w:r>
-        <w:rPr>
-          <w:rFonts w:ascii="MS Mincho" w:cs="MS Mincho" w:eastAsia="MS Mincho" w:hAnsi="MS Mincho"/>
-          <w:sz w:val="22"/>
-          <w:szCs w:val="22"/>
-        </w:rPr>
-        <w:t xml:space="preserve">(靖国)5件、</w:t>
-      </w:r>
-      <w:r>
-        <w:rPr>
-          <w:rFonts w:ascii="Consolas" w:cs="Consolas" w:eastAsia="Consolas" w:hAnsi="Consolas"/>
-          <w:sz w:val="20"/>
-          <w:szCs w:val="20"/>
-        </w:rPr>
-        <w:t xml:space="preserve">NANJING</w:t>
-      </w:r>
-      <w:r>
-        <w:rPr>
-          <w:rFonts w:ascii="MS Mincho" w:cs="MS Mincho" w:eastAsia="MS Mincho" w:hAnsi="MS Mincho"/>
-          <w:sz w:val="22"/>
-          <w:szCs w:val="22"/>
-        </w:rPr>
-        <w:t xml:space="preserve">(南京)1件、</w:t>
-      </w:r>
-      <w:r>
-        <w:rPr>
-          <w:rFonts w:ascii="Consolas" w:cs="Consolas" w:eastAsia="Consolas" w:hAnsi="Consolas"/>
-          <w:sz w:val="20"/>
-          <w:szCs w:val="20"/>
-        </w:rPr>
-        <w:t xml:space="preserve">APOLOGY_GENERAL</w:t>
-      </w:r>
-      <w:r>
-        <w:rPr>
-          <w:rFonts w:ascii="MS Mincho" w:cs="MS Mincho" w:eastAsia="MS Mincho" w:hAnsi="MS Mincho"/>
-          <w:sz w:val="22"/>
-          <w:szCs w:val="22"/>
-        </w:rPr>
-        <w:t xml:space="preserve">(謝罪一般)1件、</w:t>
-      </w:r>
-      <w:r>
-        <w:rPr>
-          <w:rFonts w:ascii="Consolas" w:cs="Consolas" w:eastAsia="Consolas" w:hAnsi="Consolas"/>
-          <w:sz w:val="20"/>
-          <w:szCs w:val="20"/>
-        </w:rPr>
-        <w:t xml:space="preserve">COLONIAL_RULE</w:t>
-      </w:r>
-      <w:r>
-        <w:rPr>
-          <w:rFonts w:ascii="MS Mincho" w:cs="MS Mincho" w:eastAsia="MS Mincho" w:hAnsi="MS Mincho"/>
-          <w:sz w:val="22"/>
-          <w:szCs w:val="22"/>
-        </w:rPr>
-        <w:t xml:space="preserve">1件で、全件が外交部報道官または領事級officialによる発話(</w:t>
-      </w:r>
-      <w:r>
-        <w:rPr>
-          <w:rFonts w:ascii="Consolas" w:cs="Consolas" w:eastAsia="Consolas" w:hAnsi="Consolas"/>
-          <w:sz w:val="20"/>
-          <w:szCs w:val="20"/>
-        </w:rPr>
-        <w:t xml:space="preserve">speaker_level=OFFICIAL</w:t>
-      </w:r>
-      <w:r>
-        <w:rPr>
-          <w:rFonts w:ascii="MS Mincho" w:cs="MS Mincho" w:eastAsia="MS Mincho" w:hAnsi="MS Mincho"/>
-          <w:sz w:val="22"/>
-          <w:szCs w:val="22"/>
-        </w:rPr>
-        <w:t xml:space="preserve">)であり、首脳による発話は一件もない。</w:t>
+        <w:t xml:space="preserve">)による発話である。</w:t>
+      </w:r>
+      <w:r>
+        <w:rPr>
+          <w:rFonts w:ascii="Consolas" w:cs="Consolas" w:eastAsia="Consolas" w:hAnsi="Consolas"/>
+          <w:sz w:val="20"/>
+          <w:szCs w:val="20"/>
+        </w:rPr>
+        <w:t xml:space="preserve">WAR_GENERAL</w:t>
+      </w:r>
+      <w:r>
+        <w:rPr>
+          <w:rFonts w:ascii="MS Mincho" w:cs="MS Mincho" w:eastAsia="MS Mincho" w:hAnsi="MS Mincho"/>
+          <w:sz w:val="22"/>
+          <w:szCs w:val="22"/>
+        </w:rPr>
+        <w:t xml:space="preserve">の比率が前回集計(6/10)よりさらに高まったのは、広島・長崎平和式典演説12件がいずれもこの区分に該当するためである。</w:t>
       </w:r>
     </w:p>
     <w:p>
@@ -2970,7 +2920,357 @@
           <w:sz w:val="22"/>
           <w:szCs w:val="22"/>
         </w:rPr>
-        <w:t xml:space="preserve">この発話レベルの違いそのものが記憶レジームの構造差を示す一つの指標である。日本・韓国では歴史認識問題は首脳自身が語る(あるいは語らないことを選ぶ)対象であるのに対し、中国では日本の歴史認識に関わる出来事への日常的な反応は、外交部報道官という実務レベルで処理され、首脳自身が直接に言及するのは南京大虐殺80周年のような特別な記念式典(本稿収録の2025年9月ミュンヘン総領事講演はその一例で、これも首脳ではなく総領事級)に限られる。</w:t>
+        <w:t xml:space="preserve">韓国の30件は</w:t>
+      </w:r>
+      <w:r>
+        <w:rPr>
+          <w:rFonts w:ascii="Consolas" w:cs="Consolas" w:eastAsia="Consolas" w:hAnsi="Consolas"/>
+          <w:sz w:val="20"/>
+          <w:szCs w:val="20"/>
+        </w:rPr>
+        <w:t xml:space="preserve">HISTORICAL_RECOGNITION_GENERAL</w:t>
+      </w:r>
+      <w:r>
+        <w:rPr>
+          <w:rFonts w:ascii="MS Mincho" w:cs="MS Mincho" w:eastAsia="MS Mincho" w:hAnsi="MS Mincho"/>
+          <w:sz w:val="22"/>
+          <w:szCs w:val="22"/>
+        </w:rPr>
+        <w:t xml:space="preserve"> 9件、</w:t>
+      </w:r>
+      <w:r>
+        <w:rPr>
+          <w:rFonts w:ascii="Consolas" w:cs="Consolas" w:eastAsia="Consolas" w:hAnsi="Consolas"/>
+          <w:sz w:val="20"/>
+          <w:szCs w:val="20"/>
+        </w:rPr>
+        <w:t xml:space="preserve">HISTORY_TEXTBOOK</w:t>
+      </w:r>
+      <w:r>
+        <w:rPr>
+          <w:rFonts w:ascii="MS Mincho" w:cs="MS Mincho" w:eastAsia="MS Mincho" w:hAnsi="MS Mincho"/>
+          <w:sz w:val="22"/>
+          <w:szCs w:val="22"/>
+        </w:rPr>
+        <w:t xml:space="preserve">(歴史教科書)6件、</w:t>
+      </w:r>
+      <w:r>
+        <w:rPr>
+          <w:rFonts w:ascii="Consolas" w:cs="Consolas" w:eastAsia="Consolas" w:hAnsi="Consolas"/>
+          <w:sz w:val="20"/>
+          <w:szCs w:val="20"/>
+        </w:rPr>
+        <w:t xml:space="preserve">FORCED_LABOR</w:t>
+      </w:r>
+      <w:r>
+        <w:rPr>
+          <w:rFonts w:ascii="MS Mincho" w:cs="MS Mincho" w:eastAsia="MS Mincho" w:hAnsi="MS Mincho"/>
+          <w:sz w:val="22"/>
+          <w:szCs w:val="22"/>
+        </w:rPr>
+        <w:t xml:space="preserve"> 5件、</w:t>
+      </w:r>
+      <w:r>
+        <w:rPr>
+          <w:rFonts w:ascii="Consolas" w:cs="Consolas" w:eastAsia="Consolas" w:hAnsi="Consolas"/>
+          <w:sz w:val="20"/>
+          <w:szCs w:val="20"/>
+        </w:rPr>
+        <w:t xml:space="preserve">COLONIAL_RULE</w:t>
+      </w:r>
+      <w:r>
+        <w:rPr>
+          <w:rFonts w:ascii="MS Mincho" w:cs="MS Mincho" w:eastAsia="MS Mincho" w:hAnsi="MS Mincho"/>
+          <w:sz w:val="22"/>
+          <w:szCs w:val="22"/>
+        </w:rPr>
+        <w:t xml:space="preserve">(植民地支配)4件、</w:t>
+      </w:r>
+      <w:r>
+        <w:rPr>
+          <w:rFonts w:ascii="Consolas" w:cs="Consolas" w:eastAsia="Consolas" w:hAnsi="Consolas"/>
+          <w:sz w:val="20"/>
+          <w:szCs w:val="20"/>
+        </w:rPr>
+        <w:t xml:space="preserve">COMFORT_WOMEN</w:t>
+      </w:r>
+      <w:r>
+        <w:rPr>
+          <w:rFonts w:ascii="MS Mincho" w:cs="MS Mincho" w:eastAsia="MS Mincho" w:hAnsi="MS Mincho"/>
+          <w:sz w:val="22"/>
+          <w:szCs w:val="22"/>
+        </w:rPr>
+        <w:t xml:space="preserve"> 3件、</w:t>
+      </w:r>
+      <w:r>
+        <w:rPr>
+          <w:rFonts w:ascii="Consolas" w:cs="Consolas" w:eastAsia="Consolas" w:hAnsi="Consolas"/>
+          <w:sz w:val="20"/>
+          <w:szCs w:val="20"/>
+        </w:rPr>
+        <w:t xml:space="preserve">YASUKUNI</w:t>
+      </w:r>
+      <w:r>
+        <w:rPr>
+          <w:rFonts w:ascii="MS Mincho" w:cs="MS Mincho" w:eastAsia="MS Mincho" w:hAnsi="MS Mincho"/>
+          <w:sz w:val="22"/>
+          <w:szCs w:val="22"/>
+        </w:rPr>
+        <w:t xml:space="preserve">(靖国)2件、</w:t>
+      </w:r>
+      <w:r>
+        <w:rPr>
+          <w:rFonts w:ascii="Consolas" w:cs="Consolas" w:eastAsia="Consolas" w:hAnsi="Consolas"/>
+          <w:sz w:val="20"/>
+          <w:szCs w:val="20"/>
+        </w:rPr>
+        <w:t xml:space="preserve">COMPENSATION_REPARATION</w:t>
+      </w:r>
+      <w:r>
+        <w:rPr>
+          <w:rFonts w:ascii="MS Mincho" w:cs="MS Mincho" w:eastAsia="MS Mincho" w:hAnsi="MS Mincho"/>
+          <w:sz w:val="22"/>
+          <w:szCs w:val="22"/>
+        </w:rPr>
+        <w:t xml:space="preserve">(補償)1件と、前回集計より争点の多様性が大きく増した。</w:t>
+      </w:r>
+      <w:r>
+        <w:rPr>
+          <w:rFonts w:ascii="Consolas" w:cs="Consolas" w:eastAsia="Consolas" w:hAnsi="Consolas"/>
+          <w:sz w:val="20"/>
+          <w:szCs w:val="20"/>
+        </w:rPr>
+        <w:t xml:space="preserve">speaker_level</w:t>
+      </w:r>
+      <w:r>
+        <w:rPr>
+          <w:rFonts w:ascii="MS Mincho" w:cs="MS Mincho" w:eastAsia="MS Mincho" w:hAnsi="MS Mincho"/>
+          <w:sz w:val="22"/>
+          <w:szCs w:val="22"/>
+        </w:rPr>
+        <w:t xml:space="preserve">の内訳も、首脳(</w:t>
+      </w:r>
+      <w:r>
+        <w:rPr>
+          <w:rFonts w:ascii="Consolas" w:cs="Consolas" w:eastAsia="Consolas" w:hAnsi="Consolas"/>
+          <w:sz w:val="20"/>
+          <w:szCs w:val="20"/>
+        </w:rPr>
+        <w:t xml:space="preserve">HEAD</w:t>
+      </w:r>
+      <w:r>
+        <w:rPr>
+          <w:rFonts w:ascii="MS Mincho" w:cs="MS Mincho" w:eastAsia="MS Mincho" w:hAnsi="MS Mincho"/>
+          <w:sz w:val="22"/>
+          <w:szCs w:val="22"/>
+        </w:rPr>
+        <w:t xml:space="preserve">)19件に対し、外交部報道官等の実務レベル(</w:t>
+      </w:r>
+      <w:r>
+        <w:rPr>
+          <w:rFonts w:ascii="Consolas" w:cs="Consolas" w:eastAsia="Consolas" w:hAnsi="Consolas"/>
+          <w:sz w:val="20"/>
+          <w:szCs w:val="20"/>
+        </w:rPr>
+        <w:t xml:space="preserve">OFFICIAL</w:t>
+      </w:r>
+      <w:r>
+        <w:rPr>
+          <w:rFonts w:ascii="MS Mincho" w:cs="MS Mincho" w:eastAsia="MS Mincho" w:hAnsi="MS Mincho"/>
+          <w:sz w:val="22"/>
+          <w:szCs w:val="22"/>
+        </w:rPr>
+        <w:t xml:space="preserve">)が11件を占めるようになった――前回集計では韓国のOFFICIAL級発話は0件であった点が、今回の分析結果全体に大きく影響している(詳細は(三))。</w:t>
+      </w:r>
+    </w:p>
+    <w:p>
+      <w:pPr>
+        <w:spacing w:after="200" w:line="320"/>
+        <w:jc w:val="both"/>
+      </w:pPr>
+      <w:r>
+        <w:rPr>
+          <w:rFonts w:ascii="MS Mincho" w:cs="MS Mincho" w:eastAsia="MS Mincho" w:hAnsi="MS Mincho"/>
+          <w:sz w:val="22"/>
+          <w:szCs w:val="22"/>
+        </w:rPr>
+        <w:t xml:space="preserve">中国の30件は</w:t>
+      </w:r>
+      <w:r>
+        <w:rPr>
+          <w:rFonts w:ascii="Consolas" w:cs="Consolas" w:eastAsia="Consolas" w:hAnsi="Consolas"/>
+          <w:sz w:val="20"/>
+          <w:szCs w:val="20"/>
+        </w:rPr>
+        <w:t xml:space="preserve">YASUKUNI</w:t>
+      </w:r>
+      <w:r>
+        <w:rPr>
+          <w:rFonts w:ascii="MS Mincho" w:cs="MS Mincho" w:eastAsia="MS Mincho" w:hAnsi="MS Mincho"/>
+          <w:sz w:val="22"/>
+          <w:szCs w:val="22"/>
+        </w:rPr>
+        <w:t xml:space="preserve"> 10件、</w:t>
+      </w:r>
+      <w:r>
+        <w:rPr>
+          <w:rFonts w:ascii="Consolas" w:cs="Consolas" w:eastAsia="Consolas" w:hAnsi="Consolas"/>
+          <w:sz w:val="20"/>
+          <w:szCs w:val="20"/>
+        </w:rPr>
+        <w:t xml:space="preserve">NANJING</w:t>
+      </w:r>
+      <w:r>
+        <w:rPr>
+          <w:rFonts w:ascii="MS Mincho" w:cs="MS Mincho" w:eastAsia="MS Mincho" w:hAnsi="MS Mincho"/>
+          <w:sz w:val="22"/>
+          <w:szCs w:val="22"/>
+        </w:rPr>
+        <w:t xml:space="preserve">(南京)6件、</w:t>
+      </w:r>
+      <w:r>
+        <w:rPr>
+          <w:rFonts w:ascii="Consolas" w:cs="Consolas" w:eastAsia="Consolas" w:hAnsi="Consolas"/>
+          <w:sz w:val="20"/>
+          <w:szCs w:val="20"/>
+        </w:rPr>
+        <w:t xml:space="preserve">AGGRESSION</w:t>
+      </w:r>
+      <w:r>
+        <w:rPr>
+          <w:rFonts w:ascii="MS Mincho" w:cs="MS Mincho" w:eastAsia="MS Mincho" w:hAnsi="MS Mincho"/>
+          <w:sz w:val="22"/>
+          <w:szCs w:val="22"/>
+        </w:rPr>
+        <w:t xml:space="preserve">(侵略、9月18日・7月7日の年次追悼報道)7件、</w:t>
+      </w:r>
+      <w:r>
+        <w:rPr>
+          <w:rFonts w:ascii="Consolas" w:cs="Consolas" w:eastAsia="Consolas" w:hAnsi="Consolas"/>
+          <w:sz w:val="20"/>
+          <w:szCs w:val="20"/>
+        </w:rPr>
+        <w:t xml:space="preserve">HISTORICAL_RECOGNITION_GENERAL</w:t>
+      </w:r>
+      <w:r>
+        <w:rPr>
+          <w:rFonts w:ascii="MS Mincho" w:cs="MS Mincho" w:eastAsia="MS Mincho" w:hAnsi="MS Mincho"/>
+          <w:sz w:val="22"/>
+          <w:szCs w:val="22"/>
+        </w:rPr>
+        <w:t xml:space="preserve"> 4件、</w:t>
+      </w:r>
+      <w:r>
+        <w:rPr>
+          <w:rFonts w:ascii="Consolas" w:cs="Consolas" w:eastAsia="Consolas" w:hAnsi="Consolas"/>
+          <w:sz w:val="20"/>
+          <w:szCs w:val="20"/>
+        </w:rPr>
+        <w:t xml:space="preserve">APOLOGY_GENERAL</w:t>
+      </w:r>
+      <w:r>
+        <w:rPr>
+          <w:rFonts w:ascii="MS Mincho" w:cs="MS Mincho" w:eastAsia="MS Mincho" w:hAnsi="MS Mincho"/>
+          <w:sz w:val="22"/>
+          <w:szCs w:val="22"/>
+        </w:rPr>
+        <w:t xml:space="preserve">(謝罪一般)1件、</w:t>
+      </w:r>
+      <w:r>
+        <w:rPr>
+          <w:rFonts w:ascii="Consolas" w:cs="Consolas" w:eastAsia="Consolas" w:hAnsi="Consolas"/>
+          <w:sz w:val="20"/>
+          <w:szCs w:val="20"/>
+        </w:rPr>
+        <w:t xml:space="preserve">COLONIAL_RULE</w:t>
+      </w:r>
+      <w:r>
+        <w:rPr>
+          <w:rFonts w:ascii="MS Mincho" w:cs="MS Mincho" w:eastAsia="MS Mincho" w:hAnsi="MS Mincho"/>
+          <w:sz w:val="22"/>
+          <w:szCs w:val="22"/>
+        </w:rPr>
+        <w:t xml:space="preserve"> 1件、</w:t>
+      </w:r>
+      <w:r>
+        <w:rPr>
+          <w:rFonts w:ascii="Consolas" w:cs="Consolas" w:eastAsia="Consolas" w:hAnsi="Consolas"/>
+          <w:sz w:val="20"/>
+          <w:szCs w:val="20"/>
+        </w:rPr>
+        <w:t xml:space="preserve">WAR_GENERAL</w:t>
+      </w:r>
+      <w:r>
+        <w:rPr>
+          <w:rFonts w:ascii="MS Mincho" w:cs="MS Mincho" w:eastAsia="MS Mincho" w:hAnsi="MS Mincho"/>
+          <w:sz w:val="22"/>
+          <w:szCs w:val="22"/>
+        </w:rPr>
+        <w:t xml:space="preserve"> 1件で、</w:t>
+      </w:r>
+      <w:r>
+        <w:rPr>
+          <w:rFonts w:ascii="Consolas" w:cs="Consolas" w:eastAsia="Consolas" w:hAnsi="Consolas"/>
+          <w:sz w:val="20"/>
+          <w:szCs w:val="20"/>
+        </w:rPr>
+        <w:t xml:space="preserve">speaker_level</w:t>
+      </w:r>
+      <w:r>
+        <w:rPr>
+          <w:rFonts w:ascii="MS Mincho" w:cs="MS Mincho" w:eastAsia="MS Mincho" w:hAnsi="MS Mincho"/>
+          <w:sz w:val="22"/>
+          <w:szCs w:val="22"/>
+        </w:rPr>
+        <w:t xml:space="preserve">は外交部報道官(</w:t>
+      </w:r>
+      <w:r>
+        <w:rPr>
+          <w:rFonts w:ascii="Consolas" w:cs="Consolas" w:eastAsia="Consolas" w:hAnsi="Consolas"/>
+          <w:sz w:val="20"/>
+          <w:szCs w:val="20"/>
+        </w:rPr>
+        <w:t xml:space="preserve">OFFICIAL</w:t>
+      </w:r>
+      <w:r>
+        <w:rPr>
+          <w:rFonts w:ascii="MS Mincho" w:cs="MS Mincho" w:eastAsia="MS Mincho" w:hAnsi="MS Mincho"/>
+          <w:sz w:val="22"/>
+          <w:szCs w:val="22"/>
+        </w:rPr>
+        <w:t xml:space="preserve">)13件、新華社等の第三者的報道(</w:t>
+      </w:r>
+      <w:r>
+        <w:rPr>
+          <w:rFonts w:ascii="Consolas" w:cs="Consolas" w:eastAsia="Consolas" w:hAnsi="Consolas"/>
+          <w:sz w:val="20"/>
+          <w:szCs w:val="20"/>
+        </w:rPr>
+        <w:t xml:space="preserve">UNKNOWN</w:t>
+      </w:r>
+      <w:r>
+        <w:rPr>
+          <w:rFonts w:ascii="MS Mincho" w:cs="MS Mincho" w:eastAsia="MS Mincho" w:hAnsi="MS Mincho"/>
+          <w:sz w:val="22"/>
+          <w:szCs w:val="22"/>
+        </w:rPr>
+        <w:t xml:space="preserve">)12件、首脳(</w:t>
+      </w:r>
+      <w:r>
+        <w:rPr>
+          <w:rFonts w:ascii="Consolas" w:cs="Consolas" w:eastAsia="Consolas" w:hAnsi="Consolas"/>
+          <w:sz w:val="20"/>
+          <w:szCs w:val="20"/>
+        </w:rPr>
+        <w:t xml:space="preserve">HEAD</w:t>
+      </w:r>
+      <w:r>
+        <w:rPr>
+          <w:rFonts w:ascii="MS Mincho" w:cs="MS Mincho" w:eastAsia="MS Mincho" w:hAnsi="MS Mincho"/>
+          <w:sz w:val="22"/>
+          <w:szCs w:val="22"/>
+        </w:rPr>
+        <w:t xml:space="preserve">)5件という内訳である。前回集計では中国の首脳級発話は0件であったが、今回はXi国家主席自身による2025年9月3日の抗日戦争勝利80周年演説2件に加え、2022〜2024年のAPEC首脳会談(岸田・石破両首相との会談)における発言記録3件を新たに追加しており、この5件が(三)で述べる決定的な知見をもたらしている。</w:t>
       </w:r>
     </w:p>
     <w:p>
@@ -3007,7 +3307,39 @@
           <w:sz w:val="22"/>
           <w:szCs w:val="22"/>
         </w:rPr>
-        <w:t xml:space="preserve">(明示的謝罪)は三国いずれも0件であった。日本の10件は、いずれも自国の戦争死者を悼む文脈での発話であり、外国人被害者への言及や謝罪は含まれていない。韓国・中国の10件・8件は、いずれも自国が謝罪する立場ではなく、日本の歴史認識・謝罪の妥当性を評価・要求する立場からの発話であるため、この点でも</w:t>
+        <w:t xml:space="preserve">(明示的謝罪)・</w:t>
+      </w:r>
+      <w:r>
+        <w:rPr>
+          <w:rFonts w:ascii="Consolas" w:cs="Consolas" w:eastAsia="Consolas" w:hAnsi="Consolas"/>
+          <w:sz w:val="20"/>
+          <w:szCs w:val="20"/>
+        </w:rPr>
+        <w:t xml:space="preserve">remorse</w:t>
+      </w:r>
+      <w:r>
+        <w:rPr>
+          <w:rFonts w:ascii="MS Mincho" w:cs="MS Mincho" w:eastAsia="MS Mincho" w:hAnsi="MS Mincho"/>
+          <w:sz w:val="22"/>
+          <w:szCs w:val="22"/>
+        </w:rPr>
+        <w:t xml:space="preserve">(悔恨)・</w:t>
+      </w:r>
+      <w:r>
+        <w:rPr>
+          <w:rFonts w:ascii="Consolas" w:cs="Consolas" w:eastAsia="Consolas" w:hAnsi="Consolas"/>
+          <w:sz w:val="20"/>
+          <w:szCs w:val="20"/>
+        </w:rPr>
+        <w:t xml:space="preserve">pardon_or_forgiveness</w:t>
+      </w:r>
+      <w:r>
+        <w:rPr>
+          <w:rFonts w:ascii="MS Mincho" w:cs="MS Mincho" w:eastAsia="MS Mincho" w:hAnsi="MS Mincho"/>
+          <w:sz w:val="22"/>
+          <w:szCs w:val="22"/>
+        </w:rPr>
+        <w:t xml:space="preserve">(赦し)は三国いずれも(remorseの日本4件を除き)ほぼ0件のままである。日本のremorse該当4件は、広島・長崎演説の一部に見られる被爆国としての悔恨表現であり、外国人被害者への言及を伴うものではない。韓国・中国は、いずれも自国が謝罪する立場ではなく、日本の歴史認識・謝罪の妥当性を評価・要求する立場からの発話が大半を占めるため、</w:t>
       </w:r>
       <w:r>
         <w:rPr>
@@ -3023,7 +3355,7 @@
           <w:sz w:val="22"/>
           <w:szCs w:val="22"/>
         </w:rPr>
-        <w:t xml:space="preserve">は当然の帰結である。</w:t>
+        <w:t xml:space="preserve">はほぼ当然の帰結である。</w:t>
       </w:r>
     </w:p>
     <w:p>
@@ -3037,31 +3369,31 @@
           <w:sz w:val="20"/>
           <w:szCs w:val="20"/>
         </w:rPr>
-        <w:t xml:space="preserve">reflection</w:t>
-      </w:r>
-      <w:r>
-        <w:rPr>
-          <w:rFonts w:ascii="MS Mincho" w:cs="MS Mincho" w:eastAsia="MS Mincho" w:hAnsi="MS Mincho"/>
-          <w:sz w:val="22"/>
-          <w:szCs w:val="22"/>
-        </w:rPr>
-        <w:t xml:space="preserve">(反省・内省的言及)は、日本7/10件(70%)、韓国4/10件(40%)、中国1/8件(12.5%)であった。日本の値が高いのは、</w:t>
-      </w:r>
-      <w:r>
-        <w:rPr>
-          <w:rFonts w:ascii="Consolas" w:cs="Consolas" w:eastAsia="Consolas" w:hAnsi="Consolas"/>
-          <w:sz w:val="20"/>
-          <w:szCs w:val="20"/>
-        </w:rPr>
-        <w:t xml:space="preserve">remedy</w:t>
-      </w:r>
-      <w:r>
-        <w:rPr>
-          <w:rFonts w:ascii="MS Mincho" w:cs="MS Mincho" w:eastAsia="MS Mincho" w:hAnsi="MS Mincho"/>
-          <w:sz w:val="22"/>
-          <w:szCs w:val="22"/>
-        </w:rPr>
-        <w:t xml:space="preserve">(9/10件、90%)と同様、毎年8月15日の全国戦没者追悼式が、自国の犠牲・喪失を悼み、政策的な未来志向(遺骨収集事業の継続、戦争の教訓の継承)を語る、内省的だが自己完結的なジャンルとして機能していることを反映する。すなわち日本の高いreflection値は、必ずしも植民地支配・侵略に対する反省を意味するものではなく、多くは自国民の犠牲に対する内省である――これは村山談話(1995年)や小泉談話(2005年、本稿では未収録)のような、外国人被害者への言及を伴う談話とは異なる部分集合であることに注意を要する。</w:t>
+        <w:t xml:space="preserve">agency_explicit</w:t>
+      </w:r>
+      <w:r>
+        <w:rPr>
+          <w:rFonts w:ascii="MS Mincho" w:cs="MS Mincho" w:eastAsia="MS Mincho" w:hAnsi="MS Mincho"/>
+          <w:sz w:val="22"/>
+          <w:szCs w:val="22"/>
+        </w:rPr>
+        <w:t xml:space="preserve">(責任主体の明示)は、日本0/30件(0%)、韓国20/28件(71%、2件は</w:t>
+      </w:r>
+      <w:r>
+        <w:rPr>
+          <w:rFonts w:ascii="Consolas" w:cs="Consolas" w:eastAsia="Consolas" w:hAnsi="Consolas"/>
+          <w:sz w:val="20"/>
+          <w:szCs w:val="20"/>
+        </w:rPr>
+        <w:t xml:space="preserve">NA</w:t>
+      </w:r>
+      <w:r>
+        <w:rPr>
+          <w:rFonts w:ascii="MS Mincho" w:cs="MS Mincho" w:eastAsia="MS Mincho" w:hAnsi="MS Mincho"/>
+          <w:sz w:val="22"/>
+          <w:szCs w:val="22"/>
+        </w:rPr>
+        <w:t xml:space="preserve">)、中国26/30件(87%)である。前回集計(日本0%・韓国60%・中国100%)と比べ、韓国はやや上昇、中国はやや低下しているが、より重要なのは、この90件サンプルで初めて可能になった発話者レベル別の分解である。</w:t>
       </w:r>
     </w:p>
     <w:p>
@@ -3071,19 +3403,11 @@
       </w:pPr>
       <w:r>
         <w:rPr>
-          <w:rFonts w:ascii="Consolas" w:cs="Consolas" w:eastAsia="Consolas" w:hAnsi="Consolas"/>
-          <w:sz w:val="20"/>
-          <w:szCs w:val="20"/>
-        </w:rPr>
-        <w:t xml:space="preserve">agency_explicit</w:t>
-      </w:r>
-      <w:r>
-        <w:rPr>
-          <w:rFonts w:ascii="MS Mincho" w:cs="MS Mincho" w:eastAsia="MS Mincho" w:hAnsi="MS Mincho"/>
-          <w:sz w:val="22"/>
-          <w:szCs w:val="22"/>
-        </w:rPr>
-        <w:t xml:space="preserve">(責任主体の明示)は、日本0/10件(0%)、韓国6/10件(60%)、中国8/8件(100%)と、明確な差が見られた。日本の10件はすべて</w:t>
+          <w:rFonts w:ascii="MS Mincho" w:cs="MS Mincho" w:eastAsia="MS Mincho" w:hAnsi="MS Mincho"/>
+          <w:sz w:val="22"/>
+          <w:szCs w:val="22"/>
+        </w:rPr>
+        <w:t xml:space="preserve">日本の30件はすべて</w:t>
       </w:r>
       <w:r>
         <w:rPr>
@@ -3115,55 +3439,55 @@
           <w:sz w:val="22"/>
           <w:szCs w:val="22"/>
         </w:rPr>
-        <w:t xml:space="preserve">)であり、行為主体が一貫して曖昧化・抽象化されている。対照的に、韓国は「日本の植民地支配」のように日本を名指しする表現が過半数を占め、中国は全件で「日本の指導者」(</w:t>
-      </w:r>
-      <w:r>
-        <w:rPr>
-          <w:rFonts w:ascii="Consolas" w:cs="Consolas" w:eastAsia="Consolas" w:hAnsi="Consolas"/>
-          <w:sz w:val="20"/>
-          <w:szCs w:val="20"/>
-        </w:rPr>
-        <w:t xml:space="preserve">LEADER</w:t>
-      </w:r>
-      <w:r>
-        <w:rPr>
-          <w:rFonts w:ascii="MS Mincho" w:cs="MS Mincho" w:eastAsia="MS Mincho" w:hAnsi="MS Mincho"/>
-          <w:sz w:val="22"/>
-          <w:szCs w:val="22"/>
-        </w:rPr>
-        <w:t xml:space="preserve">)、「日本の国家」(</w:t>
-      </w:r>
-      <w:r>
-        <w:rPr>
-          <w:rFonts w:ascii="Consolas" w:cs="Consolas" w:eastAsia="Consolas" w:hAnsi="Consolas"/>
-          <w:sz w:val="20"/>
-          <w:szCs w:val="20"/>
-        </w:rPr>
-        <w:t xml:space="preserve">STATE</w:t>
-      </w:r>
-      <w:r>
-        <w:rPr>
-          <w:rFonts w:ascii="MS Mincho" w:cs="MS Mincho" w:eastAsia="MS Mincho" w:hAnsi="MS Mincho"/>
-          <w:sz w:val="22"/>
-          <w:szCs w:val="22"/>
-        </w:rPr>
-        <w:t xml:space="preserve">)、「日本軍国主義者」(</w:t>
-      </w:r>
-      <w:r>
-        <w:rPr>
-          <w:rFonts w:ascii="Consolas" w:cs="Consolas" w:eastAsia="Consolas" w:hAnsi="Consolas"/>
-          <w:sz w:val="20"/>
-          <w:szCs w:val="20"/>
-        </w:rPr>
-        <w:t xml:space="preserve">MILITARY</w:t>
-      </w:r>
-      <w:r>
-        <w:rPr>
-          <w:rFonts w:ascii="MS Mincho" w:cs="MS Mincho" w:eastAsia="MS Mincho" w:hAnsi="MS Mincho"/>
-          <w:sz w:val="22"/>
-          <w:szCs w:val="22"/>
-        </w:rPr>
-        <w:t xml:space="preserve">)のいずれかが明示的に名指しされている。</w:t>
+        <w:t xml:space="preserve">)であり、行為主体が一貫して曖昧化されている。この0%という値は、</w:t>
+      </w:r>
+      <w:r>
+        <w:rPr>
+          <w:rFonts w:ascii="Consolas" w:cs="Consolas" w:eastAsia="Consolas" w:hAnsi="Consolas"/>
+          <w:sz w:val="20"/>
+          <w:szCs w:val="20"/>
+        </w:rPr>
+        <w:t xml:space="preserve">speaker_level</w:t>
+      </w:r>
+      <w:r>
+        <w:rPr>
+          <w:rFonts w:ascii="MS Mincho" w:cs="MS Mincho" w:eastAsia="MS Mincho" w:hAnsi="MS Mincho"/>
+          <w:sz w:val="22"/>
+          <w:szCs w:val="22"/>
+        </w:rPr>
+        <w:t xml:space="preserve">がすべて</w:t>
+      </w:r>
+      <w:r>
+        <w:rPr>
+          <w:rFonts w:ascii="Consolas" w:cs="Consolas" w:eastAsia="Consolas" w:hAnsi="Consolas"/>
+          <w:sz w:val="20"/>
+          <w:szCs w:val="20"/>
+        </w:rPr>
+        <w:t xml:space="preserve">HEAD</w:t>
+      </w:r>
+      <w:r>
+        <w:rPr>
+          <w:rFonts w:ascii="MS Mincho" w:cs="MS Mincho" w:eastAsia="MS Mincho" w:hAnsi="MS Mincho"/>
+          <w:sz w:val="22"/>
+          <w:szCs w:val="22"/>
+        </w:rPr>
+        <w:t xml:space="preserve">である30件全体・4代の首相(安倍・菅・岸田・石破)個々・</w:t>
+      </w:r>
+      <w:r>
+        <w:rPr>
+          <w:rFonts w:ascii="Consolas" w:cs="Consolas" w:eastAsia="Consolas" w:hAnsi="Consolas"/>
+          <w:sz w:val="20"/>
+          <w:szCs w:val="20"/>
+        </w:rPr>
+        <w:t xml:space="preserve">document_type</w:t>
+      </w:r>
+      <w:r>
+        <w:rPr>
+          <w:rFonts w:ascii="MS Mincho" w:cs="MS Mincho" w:eastAsia="MS Mincho" w:hAnsi="MS Mincho"/>
+          <w:sz w:val="22"/>
+          <w:szCs w:val="22"/>
+        </w:rPr>
+        <w:t xml:space="preserve">(SPEECH 18件・PRESS_CONFERENCE 11件・STATEMENT 1件)いずれにおいても例外なく成立しており、ジャンルや政権の違いによる交絡ではない、頑健な知見である。</w:t>
       </w:r>
     </w:p>
     <w:p>
@@ -3177,7 +3501,227 @@
           <w:sz w:val="22"/>
           <w:szCs w:val="22"/>
         </w:rPr>
-        <w:t xml:space="preserve">謝罪・責任語彙6項目すべての該当件数を国別に示すと、以下の通りである。</w:t>
+        <w:t xml:space="preserve">韓国は、</w:t>
+      </w:r>
+      <w:r>
+        <w:rPr>
+          <w:rFonts w:ascii="Consolas" w:cs="Consolas" w:eastAsia="Consolas" w:hAnsi="Consolas"/>
+          <w:sz w:val="20"/>
+          <w:szCs w:val="20"/>
+        </w:rPr>
+        <w:t xml:space="preserve">speaker_level=OFFICIAL</w:t>
+      </w:r>
+      <w:r>
+        <w:rPr>
+          <w:rFonts w:ascii="MS Mincho" w:cs="MS Mincho" w:eastAsia="MS Mincho" w:hAnsi="MS Mincho"/>
+          <w:sz w:val="22"/>
+          <w:szCs w:val="22"/>
+        </w:rPr>
+        <w:t xml:space="preserve">(外交部報道官級、n=11)で91%(10/11)、</w:t>
+      </w:r>
+      <w:r>
+        <w:rPr>
+          <w:rFonts w:ascii="Consolas" w:cs="Consolas" w:eastAsia="Consolas" w:hAnsi="Consolas"/>
+          <w:sz w:val="20"/>
+          <w:szCs w:val="20"/>
+        </w:rPr>
+        <w:t xml:space="preserve">speaker_level=HEAD</w:t>
+      </w:r>
+      <w:r>
+        <w:rPr>
+          <w:rFonts w:ascii="MS Mincho" w:cs="MS Mincho" w:eastAsia="MS Mincho" w:hAnsi="MS Mincho"/>
+          <w:sz w:val="22"/>
+          <w:szCs w:val="22"/>
+        </w:rPr>
+        <w:t xml:space="preserve">(大統領、n=19)で59%(10/17、2件</w:t>
+      </w:r>
+      <w:r>
+        <w:rPr>
+          <w:rFonts w:ascii="Consolas" w:cs="Consolas" w:eastAsia="Consolas" w:hAnsi="Consolas"/>
+          <w:sz w:val="20"/>
+          <w:szCs w:val="20"/>
+        </w:rPr>
+        <w:t xml:space="preserve">NA</w:t>
+      </w:r>
+      <w:r>
+        <w:rPr>
+          <w:rFonts w:ascii="MS Mincho" w:cs="MS Mincho" w:eastAsia="MS Mincho" w:hAnsi="MS Mincho"/>
+          <w:sz w:val="22"/>
+          <w:szCs w:val="22"/>
+        </w:rPr>
+        <w:t xml:space="preserve">)と、レベルによって明確な差がある。さらにHEAD級を政権別に見ると、文在寅100%(4/4)→尹錫悦50%(3/6、</w:t>
+      </w:r>
+      <w:r>
+        <w:rPr>
+          <w:rFonts w:ascii="Consolas" w:cs="Consolas" w:eastAsia="Consolas" w:hAnsi="Consolas"/>
+          <w:sz w:val="20"/>
+          <w:szCs w:val="20"/>
+        </w:rPr>
+        <w:t xml:space="preserve">NA</w:t>
+      </w:r>
+      <w:r>
+        <w:rPr>
+          <w:rFonts w:ascii="MS Mincho" w:cs="MS Mincho" w:eastAsia="MS Mincho" w:hAnsi="MS Mincho"/>
+          <w:sz w:val="22"/>
+          <w:szCs w:val="22"/>
+        </w:rPr>
+        <w:t xml:space="preserve">2件は日本に一切言及しない2023・2024年光復節演説)→李在明43%(3/7)と、政権交代に応じて低下し続けている。他方、OFFICIAL級は政権をまたいで安定的に高い(文在寅期2/2、尹錫悦期5/6、李在明期4/4――唯一の0件は、あえて収録した「無反応」の事例である尹錫悦・岸田夕食会の記録)。すなわち韓国の「行為主体明示率67〜71%」という集計値は、実際には「大統領level=政権依存で低下傾向」と「報道官level=政権を問わず一貫して高い」という、性質の異なる二つの現象の合成であり、前者のみを指して「被害政治型」と呼ぶのは不正確である。</w:t>
+      </w:r>
+    </w:p>
+    <w:p>
+      <w:pPr>
+        <w:spacing w:after="200" w:line="320"/>
+        <w:jc w:val="both"/>
+      </w:pPr>
+      <w:r>
+        <w:rPr>
+          <w:rFonts w:ascii="MS Mincho" w:cs="MS Mincho" w:eastAsia="MS Mincho" w:hAnsi="MS Mincho"/>
+          <w:sz w:val="22"/>
+          <w:szCs w:val="22"/>
+        </w:rPr>
+        <w:t xml:space="preserve">中国は、</w:t>
+      </w:r>
+      <w:r>
+        <w:rPr>
+          <w:rFonts w:ascii="Consolas" w:cs="Consolas" w:eastAsia="Consolas" w:hAnsi="Consolas"/>
+          <w:sz w:val="20"/>
+          <w:szCs w:val="20"/>
+        </w:rPr>
+        <w:t xml:space="preserve">speaker_level=OFFICIAL</w:t>
+      </w:r>
+      <w:r>
+        <w:rPr>
+          <w:rFonts w:ascii="MS Mincho" w:cs="MS Mincho" w:eastAsia="MS Mincho" w:hAnsi="MS Mincho"/>
+          <w:sz w:val="22"/>
+          <w:szCs w:val="22"/>
+        </w:rPr>
+        <w:t xml:space="preserve">(外交部報道官、n=13)と</w:t>
+      </w:r>
+      <w:r>
+        <w:rPr>
+          <w:rFonts w:ascii="Consolas" w:cs="Consolas" w:eastAsia="Consolas" w:hAnsi="Consolas"/>
+          <w:sz w:val="20"/>
+          <w:szCs w:val="20"/>
+        </w:rPr>
+        <w:t xml:space="preserve">UNKNOWN</w:t>
+      </w:r>
+      <w:r>
+        <w:rPr>
+          <w:rFonts w:ascii="MS Mincho" w:cs="MS Mincho" w:eastAsia="MS Mincho" w:hAnsi="MS Mincho"/>
+          <w:sz w:val="22"/>
+          <w:szCs w:val="22"/>
+        </w:rPr>
+        <w:t xml:space="preserve">(新華社等の第三者的報道、n=12)がいずれも100%である一方、</w:t>
+      </w:r>
+      <w:r>
+        <w:rPr>
+          <w:rFonts w:ascii="Consolas" w:cs="Consolas" w:eastAsia="Consolas" w:hAnsi="Consolas"/>
+          <w:sz w:val="20"/>
+          <w:szCs w:val="20"/>
+        </w:rPr>
+        <w:t xml:space="preserve">speaker_level=HEAD</w:t>
+      </w:r>
+      <w:r>
+        <w:rPr>
+          <w:rFonts w:ascii="MS Mincho" w:cs="MS Mincho" w:eastAsia="MS Mincho" w:hAnsi="MS Mincho"/>
+          <w:sz w:val="22"/>
+          <w:szCs w:val="22"/>
+        </w:rPr>
+        <w:t xml:space="preserve">(習近平自身の発言、n=5)ではわずか20%(1/5)にとどまる。2022〜2024年の対岸田・対石破APEC首脳会談記録3件はすべて</w:t>
+      </w:r>
+      <w:r>
+        <w:rPr>
+          <w:rFonts w:ascii="Consolas" w:cs="Consolas" w:eastAsia="Consolas" w:hAnsi="Consolas"/>
+          <w:sz w:val="20"/>
+          <w:szCs w:val="20"/>
+        </w:rPr>
+        <w:t xml:space="preserve">agency_explicit=0</w:t>
+      </w:r>
+      <w:r>
+        <w:rPr>
+          <w:rFonts w:ascii="MS Mincho" w:cs="MS Mincho" w:eastAsia="MS Mincho" w:hAnsi="MS Mincho"/>
+          <w:sz w:val="22"/>
+          <w:szCs w:val="22"/>
+        </w:rPr>
+        <w:t xml:space="preserve">で、「歴史の教訓に学ぶ」「歴史を直視する」といった抽象的な言い回しに終始し、特定の行為主体を名指ししない――これは日本の発話パターンにもっとも近い構造である。2025年9月3日の抗日戦争勝利80周年演説2件も、一方は行為主体を明示するが他方はしない、という混在を示す。前回集計時点(2026年9月22日、28件)で提起された「習近平自身の発言で同じパターンが成立するかを検証する必要がある」という課題に対する答えは、明確に「否」である。中国の</w:t>
+      </w:r>
+      <w:r>
+        <w:rPr>
+          <w:rFonts w:ascii="Consolas" w:cs="Consolas" w:eastAsia="Consolas" w:hAnsi="Consolas"/>
+          <w:sz w:val="20"/>
+          <w:szCs w:val="20"/>
+        </w:rPr>
+        <w:t xml:space="preserve">agency_explicit</w:t>
+      </w:r>
+      <w:r>
+        <w:rPr>
+          <w:rFonts w:ascii="MS Mincho" w:cs="MS Mincho" w:eastAsia="MS Mincho" w:hAnsi="MS Mincho"/>
+          <w:sz w:val="22"/>
+          <w:szCs w:val="22"/>
+        </w:rPr>
+        <w:t xml:space="preserve">のほぼ全件該当という所見は、外交部報道官・国営メディアの定型的スクリプトに特有の現象であり、中国という国家全体・その最高指導者の対日発言一般に敷衍できる特徴ではない。</w:t>
+      </w:r>
+      <w:r>
+        <w:rPr>
+          <w:rFonts w:ascii="Consolas" w:cs="Consolas" w:eastAsia="Consolas" w:hAnsi="Consolas"/>
+          <w:sz w:val="20"/>
+          <w:szCs w:val="20"/>
+        </w:rPr>
+        <w:t xml:space="preserve">document_type</w:t>
+      </w:r>
+      <w:r>
+        <w:rPr>
+          <w:rFonts w:ascii="MS Mincho" w:cs="MS Mincho" w:eastAsia="MS Mincho" w:hAnsi="MS Mincho"/>
+          <w:sz w:val="22"/>
+          <w:szCs w:val="22"/>
+        </w:rPr>
+        <w:t xml:space="preserve">だけを見ても、この違いは捉えられない点に注意を要する(APEC首脳会談記録・新華社の年次追悼報道はいずれも</w:t>
+      </w:r>
+      <w:r>
+        <w:rPr>
+          <w:rFonts w:ascii="Consolas" w:cs="Consolas" w:eastAsia="Consolas" w:hAnsi="Consolas"/>
+          <w:sz w:val="20"/>
+          <w:szCs w:val="20"/>
+        </w:rPr>
+        <w:t xml:space="preserve">document_type=OTHER</w:t>
+      </w:r>
+      <w:r>
+        <w:rPr>
+          <w:rFonts w:ascii="MS Mincho" w:cs="MS Mincho" w:eastAsia="MS Mincho" w:hAnsi="MS Mincho"/>
+          <w:sz w:val="22"/>
+          <w:szCs w:val="22"/>
+        </w:rPr>
+        <w:t xml:space="preserve">に分類されており、両者を分けているのは</w:t>
+      </w:r>
+      <w:r>
+        <w:rPr>
+          <w:rFonts w:ascii="Consolas" w:cs="Consolas" w:eastAsia="Consolas" w:hAnsi="Consolas"/>
+          <w:sz w:val="20"/>
+          <w:szCs w:val="20"/>
+        </w:rPr>
+        <w:t xml:space="preserve">speaker_level</w:t>
+      </w:r>
+      <w:r>
+        <w:rPr>
+          <w:rFonts w:ascii="MS Mincho" w:cs="MS Mincho" w:eastAsia="MS Mincho" w:hAnsi="MS Mincho"/>
+          <w:sz w:val="22"/>
+          <w:szCs w:val="22"/>
+        </w:rPr>
+        <w:t xml:space="preserve">である)。</w:t>
+      </w:r>
+    </w:p>
+    <w:p>
+      <w:pPr>
+        <w:spacing w:after="200" w:line="320"/>
+        <w:jc w:val="both"/>
+      </w:pPr>
+      <w:r>
+        <w:rPr>
+          <w:rFonts w:ascii="MS Mincho" w:cs="MS Mincho" w:eastAsia="MS Mincho" w:hAnsi="MS Mincho"/>
+          <w:sz w:val="22"/>
+          <w:szCs w:val="22"/>
+        </w:rPr>
+        <w:t xml:space="preserve">謝罪・責任語彙6項目すべての該当件数を国別に示すと、以下の通りである(各国n=30)。</w:t>
       </w:r>
     </w:p>
     <w:tbl>
@@ -3251,7 +3795,7 @@
                 <w:sz w:val="20"/>
                 <w:szCs w:val="20"/>
               </w:rPr>
-              <w:t xml:space="preserve">日本(n=10)</w:t>
+              <w:t xml:space="preserve">日本</w:t>
             </w:r>
           </w:p>
         </w:tc>
@@ -3279,7 +3823,7 @@
                 <w:sz w:val="20"/>
                 <w:szCs w:val="20"/>
               </w:rPr>
-              <w:t xml:space="preserve">韓国(n=10)</w:t>
+              <w:t xml:space="preserve">韓国</w:t>
             </w:r>
           </w:p>
         </w:tc>
@@ -3307,7 +3851,7 @@
                 <w:sz w:val="20"/>
                 <w:szCs w:val="20"/>
               </w:rPr>
-              <w:t xml:space="preserve">中国(n=8)</w:t>
+              <w:t xml:space="preserve">中国</w:t>
             </w:r>
           </w:p>
         </w:tc>
@@ -3500,7 +4044,7 @@
                 <w:sz w:val="20"/>
                 <w:szCs w:val="20"/>
               </w:rPr>
-              <w:t xml:space="preserve">6</w:t>
+              <w:t xml:space="preserve">9</w:t>
             </w:r>
           </w:p>
         </w:tc>
@@ -3527,7 +4071,7 @@
                 <w:sz w:val="20"/>
                 <w:szCs w:val="20"/>
               </w:rPr>
-              <w:t xml:space="preserve">8</w:t>
+              <w:t xml:space="preserve">10</w:t>
             </w:r>
           </w:p>
         </w:tc>
@@ -3583,7 +4127,7 @@
                 <w:sz w:val="20"/>
                 <w:szCs w:val="20"/>
               </w:rPr>
-              <w:t xml:space="preserve">2</w:t>
+              <w:t xml:space="preserve">4</w:t>
             </w:r>
           </w:p>
         </w:tc>
@@ -3693,7 +4237,7 @@
                 <w:sz w:val="20"/>
                 <w:szCs w:val="20"/>
               </w:rPr>
-              <w:t xml:space="preserve">7</w:t>
+              <w:t xml:space="preserve">20</w:t>
             </w:r>
           </w:p>
         </w:tc>
@@ -3720,7 +4264,7 @@
                 <w:sz w:val="20"/>
                 <w:szCs w:val="20"/>
               </w:rPr>
-              <w:t xml:space="preserve">4</w:t>
+              <w:t xml:space="preserve">12</w:t>
             </w:r>
           </w:p>
         </w:tc>
@@ -3747,7 +4291,7 @@
                 <w:sz w:val="20"/>
                 <w:szCs w:val="20"/>
               </w:rPr>
-              <w:t xml:space="preserve">1</w:t>
+              <w:t xml:space="preserve">5</w:t>
             </w:r>
           </w:p>
         </w:tc>
@@ -3803,7 +4347,7 @@
                 <w:sz w:val="20"/>
                 <w:szCs w:val="20"/>
               </w:rPr>
-              <w:t xml:space="preserve">9</w:t>
+              <w:t xml:space="preserve">21</w:t>
             </w:r>
           </w:p>
         </w:tc>
@@ -3830,7 +4374,7 @@
                 <w:sz w:val="20"/>
                 <w:szCs w:val="20"/>
               </w:rPr>
-              <w:t xml:space="preserve">3</w:t>
+              <w:t xml:space="preserve">6</w:t>
             </w:r>
           </w:p>
         </w:tc>
@@ -3985,6 +4529,46 @@
       </w:pPr>
       <w:r>
         <w:rPr>
+          <w:rFonts w:ascii="MS Mincho" w:cs="MS Mincho" w:eastAsia="MS Mincho" w:hAnsi="MS Mincho"/>
+          <w:sz w:val="22"/>
+          <w:szCs w:val="22"/>
+        </w:rPr>
+        <w:t xml:space="preserve">日本の</w:t>
+      </w:r>
+      <w:r>
+        <w:rPr>
+          <w:rFonts w:ascii="Consolas" w:cs="Consolas" w:eastAsia="Consolas" w:hAnsi="Consolas"/>
+          <w:sz w:val="20"/>
+          <w:szCs w:val="20"/>
+        </w:rPr>
+        <w:t xml:space="preserve">remedy</w:t>
+      </w:r>
+      <w:r>
+        <w:rPr>
+          <w:rFonts w:ascii="MS Mincho" w:cs="MS Mincho" w:eastAsia="MS Mincho" w:hAnsi="MS Mincho"/>
+          <w:sz w:val="22"/>
+          <w:szCs w:val="22"/>
+        </w:rPr>
+        <w:t xml:space="preserve">(21/30、70%)・</w:t>
+      </w:r>
+      <w:r>
+        <w:rPr>
+          <w:rFonts w:ascii="Consolas" w:cs="Consolas" w:eastAsia="Consolas" w:hAnsi="Consolas"/>
+          <w:sz w:val="20"/>
+          <w:szCs w:val="20"/>
+        </w:rPr>
+        <w:t xml:space="preserve">reflection</w:t>
+      </w:r>
+      <w:r>
+        <w:rPr>
+          <w:rFonts w:ascii="MS Mincho" w:cs="MS Mincho" w:eastAsia="MS Mincho" w:hAnsi="MS Mincho"/>
+          <w:sz w:val="22"/>
+          <w:szCs w:val="22"/>
+        </w:rPr>
+        <w:t xml:space="preserve">(20/30、67%)の高さは、広島・長崎平和式典演説を含む儀礼ジャンルが、自国の犠牲・喪失を悼み、政策的な未来志向(被爆者援護策の継続、遺骨収集事業、核軍縮への取り組み)を語る、内省的だが自己完結的な発話として機能していることを反映する。すなわち日本の高いreflection値は、必ずしも植民地支配・侵略に対する反省を意味するものではなく、多くは自国民の犠牲に対する内省である――これは村山談話(1995年)のような、外国人被害者への言及を伴う談話とは異なる部分集合であることに注意を要する。中国の</w:t>
+      </w:r>
+      <w:r>
+        <w:rPr>
           <w:rFonts w:ascii="Consolas" w:cs="Consolas" w:eastAsia="Consolas" w:hAnsi="Consolas"/>
           <w:sz w:val="20"/>
           <w:szCs w:val="20"/>
@@ -3997,23 +4581,7 @@
           <w:sz w:val="22"/>
           <w:szCs w:val="22"/>
         </w:rPr>
-        <w:t xml:space="preserve">(説明)が中国で全件(8/8)該当するのは、報道官会見という発話形式が、事実関係の説明を伴わずに成立しないためであり、他の5項目が軒並み低い(remorse/remedy/pardonはいずれも0)こととあわせて、中国の発話が「説明を通じた告発」に特化していることを示す。日本の</w:t>
-      </w:r>
-      <w:r>
-        <w:rPr>
-          <w:rFonts w:ascii="Consolas" w:cs="Consolas" w:eastAsia="Consolas" w:hAnsi="Consolas"/>
-          <w:sz w:val="20"/>
-          <w:szCs w:val="20"/>
-        </w:rPr>
-        <w:t xml:space="preserve">remedy</w:t>
-      </w:r>
-      <w:r>
-        <w:rPr>
-          <w:rFonts w:ascii="MS Mincho" w:cs="MS Mincho" w:eastAsia="MS Mincho" w:hAnsi="MS Mincho"/>
-          <w:sz w:val="22"/>
-          <w:szCs w:val="22"/>
-        </w:rPr>
-        <w:t xml:space="preserve">の高さ(9/10)は(三)で述べた通り、遺骨収集事業等の制度的対応の反復に起因する。</w:t>
+        <w:t xml:space="preserve">(10/30、33%)は、報道官会見・新華社報道という発話形式が事実関係の説明を伴わずに成立しないことを反映しており、他の項目が軒並み低い(remorse/remedy/pardonはいずれも0)こととあわせて、中国の発話が「説明を通じた告発」に特化していることを示す――この点は前回集計から変わらない。</w:t>
       </w:r>
     </w:p>
     <w:p>
@@ -4050,7 +4618,7 @@
           <w:sz w:val="22"/>
           <w:szCs w:val="22"/>
         </w:rPr>
-        <w:t xml:space="preserve">の比率は、日本10/10件(100%)、韓国7/10件(70%)、中国6/8件(75%)であった。日本の全件が政策次元に該当するのは、遺骨収集事業や基金といった制度的対応が毎年の式典発話に組み込まれているためである。</w:t>
+        <w:t xml:space="preserve">の比率は、日本24/30件(80%)、韓国21/30件(70%)、中国10/30件(33%)である。日本の値が高いのは、被爆者援護・遺骨収集事業といった制度的対応が式典発話に組み込まれているためであり、中国が大きく低下したのは、Sept18・July7の年次追悼報道やAPEC首脳会談記録の多くが具体的な政策措置に言及しない、儀礼・外交レトリック中心の発話だからである。</w:t>
       </w:r>
       <w:r>
         <w:rPr>
@@ -4066,7 +4634,7 @@
           <w:sz w:val="22"/>
           <w:szCs w:val="22"/>
         </w:rPr>
-        <w:t xml:space="preserve">の比率は、日本4/10件(40%)、韓国8/10件(80%)、中国8/8件(100%)であり、逆の傾斜を示す。中国の全件が政治次元に該当するのは、報道官会見という発話形式そのものが外交的抗議・シグナリングという政治的機能を担っているためである。</w:t>
+        <w:t xml:space="preserve">の比率は、日本11/30件(37%)、韓国23/30件(77%)、中国18/30件(60%)である。</w:t>
       </w:r>
       <w:r>
         <w:rPr>
@@ -4082,7 +4650,7 @@
           <w:sz w:val="22"/>
           <w:szCs w:val="22"/>
         </w:rPr>
-        <w:t xml:space="preserve">の比率は、日本5/10件(50%)、韓国8/10件(80%)、中国8/8件(100%)であり、日本の発話の半数は、歴史的な加害・被害を「問題」として明示的に構成することなく、儀礼・制度的対応のみで完結している――これも(三)の</w:t>
+        <w:t xml:space="preserve">の比率は、日本22/30件(73%)、韓国26/30件(87%)、中国29/30件(97%)であり、日本の発話の3割弱は、歴史的な加害・被害を「問題」として明示的に構成することなく、儀礼・制度的対応のみで完結している――これも(三)の</w:t>
       </w:r>
       <w:r>
         <w:rPr>
@@ -4098,7 +4666,39 @@
           <w:sz w:val="22"/>
           <w:szCs w:val="22"/>
         </w:rPr>
-        <w:t xml:space="preserve">と符合する。</w:t>
+        <w:t xml:space="preserve">と符合する。前回集計と比べ、日本の</w:t>
+      </w:r>
+      <w:r>
+        <w:rPr>
+          <w:rFonts w:ascii="Consolas" w:cs="Consolas" w:eastAsia="Consolas" w:hAnsi="Consolas"/>
+          <w:sz w:val="20"/>
+          <w:szCs w:val="20"/>
+        </w:rPr>
+        <w:t xml:space="preserve">kingdon_policy</w:t>
+      </w:r>
+      <w:r>
+        <w:rPr>
+          <w:rFonts w:ascii="MS Mincho" w:cs="MS Mincho" w:eastAsia="MS Mincho" w:hAnsi="MS Mincho"/>
+          <w:sz w:val="22"/>
+          <w:szCs w:val="22"/>
+        </w:rPr>
+        <w:t xml:space="preserve">・</w:t>
+      </w:r>
+      <w:r>
+        <w:rPr>
+          <w:rFonts w:ascii="Consolas" w:cs="Consolas" w:eastAsia="Consolas" w:hAnsi="Consolas"/>
+          <w:sz w:val="20"/>
+          <w:szCs w:val="20"/>
+        </w:rPr>
+        <w:t xml:space="preserve">kingdon_problem</w:t>
+      </w:r>
+      <w:r>
+        <w:rPr>
+          <w:rFonts w:ascii="MS Mincho" w:cs="MS Mincho" w:eastAsia="MS Mincho" w:hAnsi="MS Mincho"/>
+          <w:sz w:val="22"/>
+          <w:szCs w:val="22"/>
+        </w:rPr>
+        <w:t xml:space="preserve">はいずれもやや低下しているが、これはサンプル拡大に伴い、より儀礼色の強い広島・長崎演説の比重が増したためであり、実質的な解釈の変更を要するものではない。</w:t>
       </w:r>
     </w:p>
     <w:p>
@@ -4127,7 +4727,7 @@
           <w:sz w:val="22"/>
           <w:szCs w:val="22"/>
         </w:rPr>
-        <w:t xml:space="preserve">村山談話(HISTORICAL_RECOGNITION_GENERAL、apology=1、remorse=1、reflection=1、remedy=1、responsibility_actor=STATE、agency_explicit=1)は、主軸サンプル中の日本の10件と際立った対照をなす。村山談話は「植民地支配と侵略」という行為を「日本」という主体に明示的に帰属させ、かつ「深い反省」「心からのお詫び」を明言する。これに対し、2020年から2025年の毎年8月15日の全国戦没者追悼式は、行為主体を一貫して曖昧化し(agency_explicit=0)、外国人被害者への言及を欠く。この対比は、1995年から2025年までの30年間で、日本の対外発信における歴史認識言説が、明示的謝罪・行為主体の名指しから、自国民の犠牲を悼む儀礼的ジャンルへと、質的に移行したことを示唆する一つの証左である。</w:t>
+        <w:t xml:space="preserve">村山談話(HISTORICAL_RECOGNITION_GENERAL、apology=1、remorse=1、reflection=1、remedy=1、responsibility_actor=STATE、agency_explicit=1)は、主軸サンプル中の日本の30件と際立った対照をなす。村山談話は「植民地支配と侵略」という行為を「日本」という主体に明示的に帰属させ、かつ「深い反省」「心からのお詫び」を明言する。これに対し、2020年から2025年の日本側30件は、行為主体を一貫して曖昧化し(agency_explicit=0%)、外国人被害者への言及を欠く。この対比は、1995年から2025年までの30年間で、日本の対外発信における歴史認識言説が、明示的謝罪・行為主体の名指しから、自国民の犠牲を悼む儀礼的ジャンルへと、質的に移行したことを示唆する一つの証左である。</w:t>
       </w:r>
     </w:p>
     <w:p>
@@ -4156,7 +4756,7 @@
           <w:sz w:val="22"/>
           <w:szCs w:val="22"/>
         </w:rPr>
-        <w:t xml:space="preserve">以上の分析結果は、序論で提示した記憶レジームの3類型――日本=政策管理型、韓国=被害政治型、中国=主権・正統性型――を、限られたサンプルながら支持する。</w:t>
+        <w:t xml:space="preserve">以上の分析結果は、序論で提示した記憶レジームの3類型――日本=政策管理型、韓国=被害政治型、中国=主権・正統性型――を、国レベルの集計値としては支持する。ただし90件への拡張によって初めて可能になった発話者レベル別の分解は、この3類型が実際には「国家」という単位ではなく、より細かい単位――発話者の制度的地位、政権、外交の場面――によって条件づけられていることを明らかにした。以下、この点を踏まえて各類型を検討する。</w:t>
       </w:r>
     </w:p>
     <w:p>
@@ -4170,7 +4770,23 @@
           <w:sz w:val="22"/>
           <w:szCs w:val="22"/>
         </w:rPr>
-        <w:t xml:space="preserve">日本の記憶レジームは、行為主体を一貫して曖昧化しながら(agency_explicit=0%)、遺骨収集事業や基金といった制度的対応を前面に押し出す(kingdon_policy=100%)という点で、「政策管理型」と呼ぶにふさわしい。問題を「解決済み」あるいは「粛々と処理すべき事務」として閉じようとする志向が、行為主体の不明確化と制度的対応の突出という二つの指標に同時に表れている。</w:t>
+        <w:t xml:space="preserve">日本の記憶レジームは、行為主体を一貫して曖昧化しながら(agency_explicit=0%、30件全件で例外なし)、被爆者援護・遺骨収集事業といった制度的対応を前面に押し出す(kingdon_policy=80%)という点で、「政策管理型」と呼ぶにふさわしい。問題を「解決済み」あるいは「粛々と処理すべき事務」として閉じようとする志向が、行為主体の不明確化と制度的対応の突出という二つの指標に同時に表れている。本稿のサンプルは</w:t>
+      </w:r>
+      <w:r>
+        <w:rPr>
+          <w:rFonts w:ascii="Consolas" w:cs="Consolas" w:eastAsia="Consolas" w:hAnsi="Consolas"/>
+          <w:sz w:val="20"/>
+          <w:szCs w:val="20"/>
+        </w:rPr>
+        <w:t xml:space="preserve">speaker_level=HEAD</w:t>
+      </w:r>
+      <w:r>
+        <w:rPr>
+          <w:rFonts w:ascii="MS Mincho" w:cs="MS Mincho" w:eastAsia="MS Mincho" w:hAnsi="MS Mincho"/>
+          <w:sz w:val="22"/>
+          <w:szCs w:val="22"/>
+        </w:rPr>
+        <w:t xml:space="preserve">(首相)のみで構成されているため、日本についてはこの「政策管理型」がより下位の実務レベル(外務省報道官等)でも成立するのかどうかは、本稿の範囲では検証できない――韓国・中国の知見(後述)を踏まえれば、日本についても首相level以外のデータを追加すれば、異なる像が見える可能性は排除できない。</w:t>
       </w:r>
     </w:p>
     <w:p>
@@ -4184,7 +4800,7 @@
           <w:sz w:val="22"/>
           <w:szCs w:val="22"/>
         </w:rPr>
-        <w:t xml:space="preserve">韓国の記憶レジームは、行為主体を名指しする比率が相対的に高く(agency_explicit=60%)、かつ政治次元への該当率も高い(80%)という点で、歴史認識問題を国内政治・外交双方の資源として活性化させる「被害政治型」の性格を持つ。ただし本稿の追加データ(李在明政権の2025・2026年演説)は、尹錫悦政権後期に見られた「非言及」傾向からの部分的な回帰(1998年金大中・小渕宣言への再言及、「歴史の影に苦しむ人々」への言及)を示しており、記憶レジームは政権交代に応じて強度が変動する可変的な構造であることも同時に示唆している。</w:t>
+        <w:t xml:space="preserve">韓国の記憶レジームは、集計値としては行為主体を名指しする比率が相対的に高く(agency_explicit=67〜71%)、「被害政治型」の性格を持つように見える。しかし発話者レベル別に分解すると、この高さを牽引しているのは外交部報道官級の発話(91%、文在寅・尹錫悦・李在明の三政権を通じて一貫して高い)であり、大統領自身の発話(59%)は、文在寅100%→尹錫悦50%→李在明43%という、政権交代に応じた明確な低下傾向を示す。すなわち「被害政治型」という特徴づけは、韓国という国家全体よりも、①政権を問わず一貫して対日名指しを行う外交官僚機構、②政権ごとに関与の度合いが変動する大統領、という二つの異なる主体に分けて理解すべきである。李在明政権(2025〜2026年)の大統領発話は、尹錫悦政権後期よりもさらに関与度が低い――2025年8月の慰安婦記念日メッセージは日本を名指しせず、同年8月の岸田・石破両首相との東京首脳会談でも「歴史に真摯に向き合う」ことを日本に求める発言は一度きりで、他は経済・安全保障協力が中心であった――という点で、必ずしも「回復」の物語では捉えきれない。</w:t>
       </w:r>
     </w:p>
     <w:p>
@@ -4198,7 +4814,21 @@
           <w:sz w:val="22"/>
           <w:szCs w:val="22"/>
         </w:rPr>
-        <w:t xml:space="preserve">中国の記憶レジームは、行為主体の明示率が100%、政治次元該当率も100%という、最も一貫した「主権・正統性型」の特徴を示す。ただし本稿で新たに追加した2件の記録――比較的稀な非靖国事例(2025年4月、対フィリピン文脈での植民地支配言及)と、村山談話への言及事例(2025年10月、村山氏逝去への反応)――は、中国の記憶レジームが単一の靖国批判フォーミュラに尽きるものではなく、①第三国(中韓以外)の被害への言及にも同一の言説構造を適用する汎用性、②日本側の歴史的謝罪(村山談話)を否定するのではなく、その履行を要求する形で自らの正統性の根拠として援用する戦略性、という二つの拡張的側面を持つことを示している。</w:t>
+        <w:t xml:space="preserve">中国の記憶レジームは、外交部報道官・国営メディアの発話に限れば、行為主体の明示率がほぼ100%という、最も一貫した「主権・正統性型」の特徴を示す。しかし本稿で新たに追加した習近平自身の発言5件(2025年9月の抗日戦争勝利80周年演説2件、2022〜2024年の対日首脳会談3件)は、この一貫性が習近平個人の対日発言には及ばないことを示す。3件の首脳会談記録はいずれも「歴史の教訓に学ぶ」「歴史を直視する」という抽象的な表現にとどまり、行為主体を明示しない(agency_explicit=0%)――これは日本の政策管理型の語り口にもっとも近い構造である。前回集計時点で提起された「中国の一貫した高い明示率は、外交部報道官という単一ジャンルの人工物にすぎないのではないか」という懸念に対する答えは明確で、その通りである。「主権・正統性型」という特徴づけは、中国の外交部・国営メディアという実務・広報レベルの定型スクリプトを正確に指し示す一方、中国という国家、あるいはその最高指導者の対日姿勢一般に敷衍することはできない。</w:t>
+      </w:r>
+    </w:p>
+    <w:p>
+      <w:pPr>
+        <w:spacing w:after="200" w:line="320"/>
+        <w:jc w:val="both"/>
+      </w:pPr>
+      <w:r>
+        <w:rPr>
+          <w:rFonts w:ascii="MS Mincho" w:cs="MS Mincho" w:eastAsia="MS Mincho" w:hAnsi="MS Mincho"/>
+          <w:sz w:val="22"/>
+          <w:szCs w:val="22"/>
+        </w:rPr>
+        <w:t xml:space="preserve">以上をまとめると、90件サンプルが明らかにしたのは、日本=政策管理型・韓国=被害政治型・中国=主権・正統性型という3類型そのものの誤りではなく、この3類型が国家単位の固定的な性格ではなく、①発話者の制度的地位(首脳か実務級か)②政権(韓国の場合)③外交の場面(中国の場合、定例会見か首脳会談か)という複数の変数によって条件づけられた、可変的な構造であるという点である。3類型の呼称自体をどう修正・限定して提示するか(例えば「韓国の被害政治型は主に外交官僚機構に、中国の主権・正統性型は主に報道官・国営メディアの言説に妥当する」といった限定を明示的に組み込むか)は、本稿の次の改訂で取り組むべき課題として残しておく。</w:t>
       </w:r>
     </w:p>
     <w:p>
@@ -4227,7 +4857,7 @@
           <w:sz w:val="22"/>
           <w:szCs w:val="22"/>
         </w:rPr>
-        <w:t xml:space="preserve">本稿は、日本・韓国・中国の政府発話29件(主軸28件+歴史的画期1件)の文脈的コーディングに基づき、歴史認識問題の反復的再燃を、謝罪の十分性ではなく各国の記憶レジームの構造差から説明する枠組みを提示した。日本=政策管理型、韓国=被害政治型、中国=主権・正統性型という3類型は、行為主体の明示性、Kingdonの政策・政治次元への布置という二つの量的指標によって、限られたサンプルながら裏づけられた。</w:t>
+        <w:t xml:space="preserve">本稿は、日本・韓国・中国の政府発話91件(主軸90件+歴史的画期1件)の文脈的コーディングに基づき、歴史認識問題の反復的再燃を、謝罪の十分性ではなく各国の記憶レジームの構造差から説明する枠組みを提示した。日本=政策管理型、韓国=被害政治型、中国=主権・正統性型という3類型は、行為主体の明示性、Kingdonの政策・政治次元への布置という二つの量的指標によって、国レベルの集計値としては裏づけられる。ただし発話者の制度的地位(首脳か実務級か)、政権、外交の場面という下位次元まで分解すると、この3類型は国家単位の固定的性格ではなく、韓国では大統領level(政権依存)と外交官僚level(政権を問わず安定)の乖離として、中国では報道官・国営メディアlevel(ほぼ一貫)と最高指導者level(むしろ日本に近い抽象的な語り口)の乖離として現れる、より条件付きの構造であることが明らかになった(7節)。</w:t>
       </w:r>
     </w:p>
     <w:p>
@@ -4241,7 +4871,7 @@
           <w:sz w:val="22"/>
           <w:szCs w:val="22"/>
         </w:rPr>
-        <w:t xml:space="preserve">今後の課題として、以下を挙げる。第一に、日本側の未コーディング候補736件のうち、コンテキストに応じて追加コーディングを進め、政権交代(菅→岸田→石破)に伴う変化をより精確に捉えること。第二に、Internet Archiveへのアクセス回復後、小泉純一郎首相の靖国参拝(2001-2006年)、2005年教科書問題、2015年日韓慰安婦合意、2018年徴用工判決という歴史的画期を追加し、記憶レジームの経時的変化をより長期の視点から検証すること。第三に、各国の原語資料との比較を通じて、本稿が対象とした対外発信用言説と国内向け言説との異同を検討し、記憶レジーム分析を司法判断・市民運動・教育制度・記念施設を含めたより広い制度的射程へと拡張することである。</w:t>
+        <w:t xml:space="preserve">今後の課題として、以下を挙げる。第一に、3類型の呼称そのものを、上述の発話者レベル別の知見を組み込む形で再定式化すること――本稿では課題として指摘するに留め、着手していない。第二に、日本側の未コーディング候補718件のうち、コンテキストに応じて追加コーディングを進め、政権交代(菅→岸田→石破)に伴う変化をより精確に捉えること。第三に、Internet Archiveへのアクセス回復後、小泉純一郎首相の靖国参拝(2001-2006年)、2005年教科書問題、2015年日韓慰安婦合意、2018年徴用工判決という歴史的画期を追加し、記憶レジームの経時的変化をより長期の視点から検証すること。第四に、各国の原語資料との比較を通じて、本稿が対象とした対外発信用言説と国内向け言説との異同を検討し、記憶レジーム分析を司法判断・市民運動・教育制度・記念施設を含めたより広い制度的射程へと拡張することである。</w:t>
       </w:r>
     </w:p>
     <w:p>
@@ -4440,7 +5070,7 @@
           <w:sz w:val="22"/>
           <w:szCs w:val="22"/>
         </w:rPr>
-        <w:t xml:space="preserve">Drawing on Kingdon's multiple-streams framework as an auxiliary lens, the paper codes 29 official English-language statements by government leaders and spokespersons of Japan, South Korea, and China (28 from a 2020-2026 main sample plus one pre-2020 landmark statement, the 1995 Murayama Statement), read in full and coded for issue type, Kingdon's problem/policy/politics dimensions, apology-related vocabulary (apology, explanation, remorse, reflection, remedy, forgiveness), and the explicitness of attributed responsibility. The share of statements that explicitly name a responsible agent differs sharply by country — 0% for Japan, 60% for South Korea, and 100% for China — and this difference maps onto three distinct memory-regime types: a policy-management regime in Japan, in which responsibility is consistently left unattributed while institutional remedies (e.g. repatriation of war dead's remains) are foregrounded; a victim-politics regime in South Korea, in which Japan is more often named explicitly and the issue is activated as both a domestic-political and diplomatic resource, albeit with engagement that has fluctuated across the Moon, Yoon, and Lee administrations; and a sovereignty-legitimacy regime in China, in which every statement both names an explicit responsible agent and is coded as belonging to Kingdon's political dimension, reflecting a standing institutional script deployed by the Ministry of Foreign Affairs. A keyness (log-likelihood) analysis of the corpus's vocabulary corroborates this typology at the lexical level: Japan's most distinctive words reflect a ceremonial genre (prime, minister, memorial, cabinet), South Korea's reflect a national-independence narrative (freedom, independence, liberation), and China's are the only ones in which the substantive issue vocabulary itself (aggression, resistance, Yasukuni, justice) rises to the top.</w:t>
+        <w:t xml:space="preserve">Drawing on Kingdon's multiple-streams framework as an auxiliary lens, the paper codes 91 official English-language statements by government leaders, spokespersons, and state media of Japan, South Korea, and China (90 from a 2020-2026 main sample, evenly split 30/30/30 across the three countries, plus one pre-2020 landmark statement, the 1995 Murayama Statement), read in full and coded for issue type, speaker level, Kingdon's problem/policy/politics dimensions, apology-related vocabulary (apology, explanation, remorse, reflection, remedy, forgiveness), and the explicitness of attributed responsibility. At the country level, the share of statements that explicitly name a responsible agent differs sharply — 0% for Japan, 71% for South Korea (excluding two statements that do not mention Japan at all), and 87% for China — and this difference maps onto three distinct memory-regime types: a policy-management regime in Japan, in which responsibility is consistently left unattributed while institutional remedies (e.g. relief for atomic-bomb survivors, repatriation of war dead's remains) are foregrounded; a victim-politics regime in South Korea, in which Japan is more often named explicitly and the issue is activated as both a domestic-political and diplomatic resource; and a sovereignty-legitimacy regime in China, in which most statements both name an explicit responsible agent and are coded as belonging to Kingdon's political dimension, reflecting a standing institutional script.</w:t>
       </w:r>
     </w:p>
     <w:p>
@@ -4454,7 +5084,21 @@
           <w:sz w:val="22"/>
           <w:szCs w:val="22"/>
         </w:rPr>
-        <w:t xml:space="preserve">The paper concludes that the recurrence of historical recognition disputes in East Asia is not simply a matter of insufficiently sincere apologies, but of how each country's memory regime differently links the problem, policy, and politics dimensions of the issue — and that this structural difference, rather than apology sufficiency per se, should be the object of comparative analysis going forward.</w:t>
+        <w:t xml:space="preserve">Decomposing these country-level figures by speaker level, however, shows that the apparent national uniformity in South Korea and China is largely an artifact of which office is speaking. In South Korea, the Ministry of Foreign Affairs spokesperson level names Japan explicitly at a stable ~91% across the Moon, Yoon, and Lee administrations, while the presidential level itself declines steadily across the same three administrations (100% under Moon, 50% under Yoon, 43% under Lee) — the "victim-politics" label fits the bureaucratic register far better than any single president's own statements. In China, the spokesperson and state-media level is likewise near-uniform (~100%), but newly added data on Xi Jinping's own words — three APEC-summit meetings with Japanese prime ministers (2022-2024) in addition to two 2025 war-anniversary speeches — shows the opposite pattern: only 20% of Xi's own statements name a responsible agent explicitly, with the summit remarks instead using the same kind of abstract, unaddressed language ("draw lessons from history") that characterizes Japan's own policy-management regime. A keyness (log-likelihood) analysis of the corpus's vocabulary corroborates the country-level typology at the lexical level while also reflecting genre composition: Japan's most distinctive words now reflect the atomic-bomb commemorations that make up a large share of the expanded sample (atomic, nuclear, bomb, Hiroshima, Nagasaki), South Korea's reflect a national-independence narrative (freedom, independence, liberation), and China's are the only ones in which the substantive issue vocabulary itself and named historical events (aggression, Nanjing, massacre, Yasukuni) rise to the top.</w:t>
+      </w:r>
+    </w:p>
+    <w:p>
+      <w:pPr>
+        <w:spacing w:after="240" w:line="320"/>
+        <w:ind w:firstLine="360"/>
+        <w:jc w:val="both"/>
+      </w:pPr>
+      <w:r>
+        <w:rPr>
+          <w:sz w:val="22"/>
+          <w:szCs w:val="22"/>
+        </w:rPr>
+        <w:t xml:space="preserve">The paper concludes that the recurrence of historical recognition disputes in East Asia is not simply a matter of insufficiently sincere apologies, but of how each country's memory regime differently links the problem, policy, and politics dimensions of the issue. It further argues that these memory regimes are not fixed national traits but are conditioned by speaker level, administration, and diplomatic occasion — a qualification that should be built into the three-type typology itself in future revisions, rather than treated as a caveat to an otherwise country-level claim.</w:t>
       </w:r>
     </w:p>
     <w:p>
@@ -4519,7 +5163,7 @@
           <w:sz w:val="22"/>
           <w:szCs w:val="22"/>
         </w:rPr>
-        <w:t xml:space="preserve">本稿はKingdonの政策の窓モデルを補助線として、日中韓の政府首脳・報道官による公式英語発話29件(2020〜2026年の主軸28件+1995年の村山談話1件)を全文読解し、争点類型、Kingdonの問題・政策・政治の三次元、謝罪関連語彙(謝罪・説明・悔恨・反省・救済・赦し)、行為主体の明示性についてコーディングした。行為主体を明示する発話の比率は、日本0%、韓国60%、中国100%と国によって顕著に異なり、この差異は三つの異なる記憶レジーム類型に対応する。すなわち、行為主体を一貫して曖昧化しながら遺骨収集事業等の制度的対応を前面に出す日本の「政策管理型」、日本を名指しする頻度が相対的に高く、文在寅・尹錫悦・李在明の各政権を通じて強度が変動しながらも国内政治・外交双方の資源として問題を活性化させる韓国の「被害政治型」、そして全件が行為主体を明示しKingdonの政治次元に該当する、外交部の定型的スクリプトを反映した中国の「主権・正統性型」である。語彙レベルのキーネス分析もこの類型論を裏づける――日本の特徴語は儀礼的ジャンルを反映し(prime, minister, memorial, cabinet)、韓国のそれは自国独立史ナラティブを反映し(freedom, independence, liberation)、実質的な争点語彙そのものが上位に現れるのは中国のみである(aggression, resistance, yasukuni, justice)。</w:t>
+        <w:t xml:space="preserve">本稿はKingdonの政策の窓モデルを補助線として、日中韓の政府首脳・報道官・国営メディアによる公式英語発話91件(2020〜2026年の主軸90件、日中韓各30件+1995年の村山談話1件)を全文読解し、争点類型、発話者レベル、Kingdonの問題・政策・政治の三次元、謝罪関連語彙(謝罪・説明・悔恨・反省・救済・赦し)、行為主体の明示性についてコーディングした。国レベルで集計すると、行為主体を明示する発話の比率は、日本0%、韓国71%(日本に一切言及しない2件を除く)、中国87%と顕著に異なり、この差異は三つの異なる記憶レジーム類型に対応する。すなわち、行為主体を一貫して曖昧化しながら被爆者援護・遺骨収集事業等の制度的対応を前面に出す日本の「政策管理型」、日本を名指しする頻度が相対的に高く国内政治・外交双方の資源として問題を活性化させる韓国の「被害政治型」、そして大半の発話が行為主体を明示しKingdonの政治次元に該当する、定型的スクリプトを反映した中国の「主権・正統性型」である。</w:t>
       </w:r>
     </w:p>
     <w:p>
@@ -4534,7 +5178,22 @@
           <w:sz w:val="22"/>
           <w:szCs w:val="22"/>
         </w:rPr>
-        <w:t xml:space="preserve">本稿は、東アジアにおける歴史認識問題の反復的再燃が、単なる謝罪の不誠実さの問題ではなく、各国の記憶レジームが問題・政策・政治の三次元をいかに異なる形で結びつけているかという構造の問題であり、今後の比較分析はこの構造的差異そのものを対象とすべきであると結論づける。</w:t>
+        <w:t xml:space="preserve">ただし発話者レベル別に分解すると、韓国・中国いずれにおいても、この国レベルの一様性は実務レベルの発話に由来するものであることが明らかになる。韓国では、外交部報道官級の発話は文在寅・尹錫悦・李在明の三政権を通じて一貫して高い(約91%)一方、大統領自身の発話はこの間に一貫して低下している(文在寅100%→尹錫悦50%→李在明43%)――「被害政治型」は大統領個人よりも外交官僚機構をこそ言い当てている。中国でも、報道官・国営メディア級の発話はほぼ一様に高い(約100%)一方、新たに追加した習近平自身の発言(2022〜2024年の対日首脳会談3件、2025年の抗日戦争勝利80周年演説2件を含む5件)ではわずか20%にとどまり、首脳会談での発言は「歴史の教訓に学ぶ」といった、日本の政策管理型に近い抽象的な語り口をとる。語彙レベルのキーネス分析も国レベルの類型論を裏づける一方でサンプル構成を反映している――日本の特徴語は、サンプル拡大に伴い増えた原爆式典演説を反映し(atomic, nuclear, bomb, hiroshima, nagasaki)、韓国のそれは自国独立史ナラティブを反映し(freedom, independence, liberation)、実質的な争点語彙・特定の歴史的事件名そのものが上位に現れるのは中国のみである(aggression, nanjing, massacre, yasukuni)。</w:t>
+      </w:r>
+    </w:p>
+    <w:p>
+      <w:pPr>
+        <w:spacing w:after="240" w:line="320"/>
+        <w:ind w:firstLine="240"/>
+        <w:jc w:val="both"/>
+      </w:pPr>
+      <w:r>
+        <w:rPr>
+          <w:rFonts w:ascii="MS Mincho" w:cs="MS Mincho" w:eastAsia="MS Mincho" w:hAnsi="MS Mincho"/>
+          <w:sz w:val="22"/>
+          <w:szCs w:val="22"/>
+        </w:rPr>
+        <w:t xml:space="preserve">本稿は、東アジアにおける歴史認識問題の反復的再燃が、単なる謝罪の不誠実さの問題ではなく、各国の記憶レジームが問題・政策・政治の三次元をいかに異なる形で結びつけているかという構造の問題であると結論づける。さらに、これらの記憶レジームは固定的な国家特性ではなく、発話者レベル・政権・外交の場面によって条件づけられた可変的な構造であることを示し、この限定を3類型論そのものにどう組み込むかを今後の課題として提示する。</w:t>
       </w:r>
     </w:p>
     <w:p>
@@ -4574,7 +5233,7 @@
           <w:sz w:val="20"/>
           <w:szCs w:val="20"/>
         </w:rPr>
-        <w:t xml:space="preserve">以下は2026-09-22更新時点の作業メモであり、原稿本体の一部ではない。</w:t>
+        <w:t xml:space="preserve">以下は2026-09-22更新時点(2回目の改訂を含む)の作業メモであり、原稿本体の一部ではない。</w:t>
       </w:r>
     </w:p>
     <w:p>
@@ -4625,7 +5284,7 @@
           <w:sz w:val="20"/>
           <w:szCs w:val="20"/>
         </w:rPr>
-        <w:t xml:space="preserve">計量テキスト分析はスライドのものを流用せず、実際の29件のコーパスからやり直した(6節(一)の頻出語表、(三)の謝罪・責任語彙6項目表)。スライドにあった時期×国家の対応分析(1991〜2016年のビン分割)は、本稿のコーパスが時間的にほぼ2020〜2026年に集中している(村山談話1件のみ1995年)ため再現できず、意図的に割愛している――時系列分析を行うには、8節で述べた歴史的画期(小泉靖国参拝、2005年教科書問題等)の追加が前提になる。</w:t>
+        <w:t xml:space="preserve">英文タイトル+Abstract、および和文要旨を追加(ご依頼の通り日英両方)。サンプルPDF(『法政論叢』第51巻第1号)の書式に倣い、本文・註のあとに独立ページとして配置し、著者名は同PDFの通常論文の表記(ローマ字、姓・名の順、大文字化なし――政府発表資料側の慣行(例:KISHIDA Fumio)とは異なる)に合わせた。英文要旨は和文要旨の逐語訳ではなく、英語論文要旨としての慣用的な構成(背景→方法→主要な知見→結論)で独自に書き起こした。</w:t>
       </w:r>
     </w:p>
     <w:p>
@@ -4642,7 +5301,7 @@
           <w:sz w:val="20"/>
           <w:szCs w:val="20"/>
         </w:rPr>
-        <w:t xml:space="preserve">6節(分析結果)の数値はすべて pilot_east_asia_2020_2025.csv(28件)・landmark_anchors.csv(1件)から実際に集計したもの(頻出語分析のみresponse_text全文を国別に結合してLL値を算出)。</w:t>
+        <w:t xml:space="preserve">【2026-09-22 追加更新:90件データでの計量テキスト分析の再計算】コーパスが28件(日本10・韓国10・中国8)から90件(日本・韓国・中国各30件)に拡張されたことを受け、6節の頻出語キーネス表・争点分布・謝罪責任語彙6項目表・Kingdon三次元の数値をすべて pilot_east_asia_2020_2025.csv(90件)・landmark_anchors.csv(1件)から再計算した。要旨(日英・和文再掲とも)、7節(考察)、8節(おわりに)の該当数値も合わせて更新した。</w:t>
       </w:r>
     </w:p>
     <w:p>
@@ -4659,24 +5318,7 @@
           <w:sz w:val="20"/>
           <w:szCs w:val="20"/>
         </w:rPr>
-        <w:t xml:space="preserve">7節(考察)・8節(おわりに)は、実際のコーディング結果に基づいて新たに書き起こしたもので、旧スライドの記述とは分析の粒度が異なる。</w:t>
-      </w:r>
-    </w:p>
-    <w:p>
-      <w:pPr>
-        <w:shd w:fill="F2F2F2" w:val="clear"/>
-        <w:spacing w:after="160"/>
-        <w:ind w:left="360" w:hanging="200"/>
-      </w:pPr>
-      <w:r>
-        <w:rPr>
-          <w:rFonts w:ascii="MS Mincho" w:cs="MS Mincho" w:eastAsia="MS Mincho" w:hAnsi="MS Mincho"/>
-          <w:i/>
-          <w:iCs/>
-          <w:sz w:val="20"/>
-          <w:szCs w:val="20"/>
-        </w:rPr>
-        <w:t xml:space="preserve">英文タイトル+Abstract、および和文要旨を追加(ご依頼の通り日英両方)。サンプルPDF(『法政論叢』第51巻第1号)の書式に倣い、本文・註のあとに独立ページとして配置し、著者名は同PDFの通常論文の表記(ローマ字、姓・名の順、大文字化なし――政府発表資料側の慣行(例:KISHIDA Fumio)とは異なる)に合わせた。冒頭の日本語要旨も、実際の集計結果(行為主体明示率 日本0%・韓国60%・中国100%)を反映して更新している。英文要旨は和文要旨の逐語訳ではなく、英語論文要旨としての慣用的な構成(背景→方法→主要な知見→結論)で独自に書き起こした。</w:t>
+        <w:t xml:space="preserve">併せて phase2_plan.md で実施した、ジャンル・発話者レベル・政権別の交絡チェックの再実行結果(90件サンプル)を7節に反映した。最大の変更点は、韓国・中国について新たに speaker_level=OFFICIAL(韓国11件)・speaker_level=HEAD(中国5件、うち3件は今回新規収集の習近平・岸田/石破APEC首脳会談記録)が十分な件数揃ったことで、国レベルの集計値(行為主体明示率)が実際には発話者レベルによって大きく分解されるという知見が得られた点である。具体的には、韓国は外交部報道官level(政権を問わず約91%で安定)と大統領level(文在寅100%→尹錫悦50%→李在明43%と政権依存で低下)に分かれ、中国は報道官・国営メディアlevel(ほぼ100%)と習近平自身の発言level(20%、日本の政策管理型に近い抽象的な語り口)に分かれる。7節ではこの知見を踏まえ、3類型を「国家単位の固定的性格」ではなく「発話者レベル・政権・外交場面によって条件づけられた可変的構造」として再提示し、3類型の呼称自体の再定式化は次の改訂の課題として明示的に残した(ユーザーから「3類型結論の言い方の見直し」自体は本更新の対象外と指示されたため、呼称そのものは変更していない)。</w:t>
       </w:r>
     </w:p>
     <w:sectPr>

</xml_diff>

<commit_message>
Regenerate draft_paper_ja.docx with the register-based 3-type reformulation
Rebuilds the Word export from the current draft_paper_ja.md content:
the reformulated abstract (Japanese, English, Japanese restatement),
Section 4's new paragraph on speaker level as an intra-country analytical
axis, Section 7's two-subsection discussion (register reformulation +
implications), Section 8's revised conclusion, and two new dated entries
in the closing editorial memo.

Structurally validated (208 paragraphs, XSD schema check passed) via the
docx skill's validate.py, since LibreOffice headless PDF conversion
remains broken in this environment.

Co-Authored-By: Claude Sonnet 5 <noreply@anthropic.com>
Claude-Session: https://claude.ai/code/session_01Hgsjh1eSNj2HnyE3spMHxL
</commit_message>
<xml_diff>
--- a/draft_paper_ja.docx
+++ b/draft_paper_ja.docx
@@ -72,7 +72,7 @@
           <w:sz w:val="22"/>
           <w:szCs w:val="22"/>
         </w:rPr>
-        <w:t xml:space="preserve">本稿は、日本・韓国・中国の政府および指導者が対外的に発信した歴史認識関連の公式英語文書91件(2020〜2026年の主軸90件+1995年の歴史的画期1件)を素材に、「記憶レジーム」という分析枠組みを提示する。歴史認識問題は単なる謝罪の有無や十分性の問題ではなく、各国が過去をどのように制度化し、誰に責任を負わせ、どのような言説で正当化するかという構造の問題である。全文の文脈的コーディングの結果、行為主体を明示する発話の比率は日本0%・韓国67%(欠損2件を除く)・中国87%と顕著な差があり、この差異は各国の記憶レジームの類型――日本=政策管理型、韓国=被害政治型、中国=主権・正統性型――と対応することを示す。ただし発話者レベル別に分解すると、韓国・中国いずれも、この高い比率を牽引しているのは外交部報道官等の実務レベルの発話であり(韓国91%、中国100%)、首脳自身の発話ではこの比率が大きく下がる(韓国43〜100%と政権により変動、中国はわずか20%)。本稿はこの3類型をKingdonの政策の窓モデルと接続することで、歴史認識問題がなぜ反復的に再燃するのかを説明するとともに、「国家の記憶レジーム」という語り方が実際には発話者レベルによって大きく条件づけられていることを示す。</w:t>
+        <w:t xml:space="preserve">本稿は、日本・韓国・中国の政府および指導者が対外的に発信した歴史認識関連の公式英語文書91件(2020〜2026年の主軸90件+1995年の歴史的画期1件)を素材に、「記憶レジーム」という分析枠組みを提示する。歴史認識問題は単なる謝罪の有無や十分性の問題ではなく、各国が過去をどのように制度化し、誰に責任を負わせ、どのような言説で正当化するかという構造の問題である。全文の文脈的コーディングの結果、行為主体を明示する発話の比率は日本0%・韓国67%(欠損2件を除く)・中国87%と顕著な差があり、この差異は当初、各国の記憶レジームの類型――日本=政策管理型、韓国=被害政治型、中国=主権・正統性型――に対応するものと解釈された。しかし発話者レベル別に分解すると、この3類型は国家の固定的性格ではなく、政権交代をまたいで安定した「実務・広報レジスター」(外交部報道官・国営メディア等が担い、韓国91%・中国100%と、まさに被害政治型・主権正統性型の描写が当てはまる層)と、政権・指導者・外交場面によって大きく変動する「首脳レジスター」(日本は4代の首相を通じ一貫して0%、韓国は政権により43〜100%、中国は習近平の対日首脳会談でわずか20%)という、二層構造の記憶レジームであることが明らかになった。本稿はこの知見に基づき、3類型を国家単位の性格描写から発話レジスター単位の記述へと再定式化し、実務・首脳レジスター間の非対称な乖離こそが、首脳間の「未来志向」対話にもかかわらず歴史認識問題が反復的に再燃する一因であると論じる。</w:t>
       </w:r>
     </w:p>
     <w:p>
@@ -259,6 +259,20 @@
           <w:szCs w:val="22"/>
         </w:rPr>
         <w:t xml:space="preserve">補助線として、Kingdonの「政策の窓」モデルを導入する。歴史認識問題が政策過程のどこで機能するのかを明確化するためである。問題次元は被害・加害・不正義・責任が「公的問題」として構成される局面、政策次元は謝罪・補償・基金・合意・教育・制度改革などの解決策が提示される局面、政治次元は国内政治上の動員、対外シグナリング、外交的圧力、政権正統性の構築が行われる局面を指す。歴史認識問題は、この三次元のどこに置かれるかによって、異なる政治的効果を持つ。</w:t>
+      </w:r>
+    </w:p>
+    <w:p>
+      <w:pPr>
+        <w:spacing w:after="200" w:line="320"/>
+        <w:jc w:val="both"/>
+      </w:pPr>
+      <w:r>
+        <w:rPr>
+          <w:rFonts w:ascii="MS Mincho" w:cs="MS Mincho" w:eastAsia="MS Mincho" w:hAnsi="MS Mincho"/>
+          <w:sz w:val="22"/>
+          <w:szCs w:val="22"/>
+        </w:rPr>
+        <w:t xml:space="preserve">記憶レジームの第一の要素として掲げた「公的記憶の主体」(誰が語るのか)は、本稿ではもう一段踏み込んで、一国内部の異質性を捉える軸として理論的に位置づけ直す。すなわち、一国の記憶レジームを単一の国家的性格として記述するのではなく、同じ国のなかでも「誰が語るか」(首脳か、外交当局の実務・広報機構か)によって、責任構築の様式そのものが異なるレジスター(言説様式)の束から成る、より階層化された構造として捉える。6・7節で示す通り、この階層性は本稿の三類型そのものの反証ではなく、三類型がどの発話者層において最も強く成立するかを特定するための、記憶レジーム概念に内在していた分析軸である。</w:t>
       </w:r>
     </w:p>
     <w:p>
@@ -4747,6 +4761,21 @@
     </w:p>
     <w:p>
       <w:pPr>
+        <w:spacing w:after="120" w:before="200"/>
+      </w:pPr>
+      <w:r>
+        <w:rPr>
+          <w:rFonts w:ascii="MS Mincho" w:cs="MS Mincho" w:eastAsia="MS Mincho" w:hAnsi="MS Mincho"/>
+          <w:b/>
+          <w:bCs/>
+          <w:sz w:val="22"/>
+          <w:szCs w:val="22"/>
+        </w:rPr>
+        <w:t xml:space="preserve">(一)3類型の再定式化:国家単位から発話レジスター単位へ</w:t>
+      </w:r>
+    </w:p>
+    <w:p>
+      <w:pPr>
         <w:spacing w:after="200" w:line="320"/>
         <w:jc w:val="both"/>
       </w:pPr>
@@ -4756,7 +4785,39 @@
           <w:sz w:val="22"/>
           <w:szCs w:val="22"/>
         </w:rPr>
-        <w:t xml:space="preserve">以上の分析結果は、序論で提示した記憶レジームの3類型――日本=政策管理型、韓国=被害政治型、中国=主権・正統性型――を、国レベルの集計値としては支持する。ただし90件への拡張によって初めて可能になった発話者レベル別の分解は、この3類型が実際には「国家」という単位ではなく、より細かい単位――発話者の制度的地位、政権、外交の場面――によって条件づけられていることを明らかにした。以下、この点を踏まえて各類型を検討する。</w:t>
+        <w:t xml:space="preserve">以上の分析結果は、序論で提示した記憶レジームの3類型――日本=政策管理型、韓国=被害政治型、中国=主権・正統性型――が、国家という単位そのものの性格描写としては成立しないことを示している。90件への拡張によって初めて可能になった発話者レベル別の分解が示すのは、この3類型が実際には、一国のなかで「誰が語るか」によって使い分けられる複数の発話レジスター(言説様式)のうち、量的に卓越した一つを国名で代表させたものにすぎない、という点である。本稿はこれを踏まえ、3類型を国家の固定的性格としてではなく、①比較的安定した</w:t>
+      </w:r>
+      <w:r>
+        <w:rPr>
+          <w:rFonts w:ascii="Consolas" w:cs="Consolas" w:eastAsia="Consolas" w:hAnsi="Consolas"/>
+          <w:sz w:val="20"/>
+          <w:szCs w:val="20"/>
+        </w:rPr>
+        <w:t xml:space="preserve">実務・広報レジスター</w:t>
+      </w:r>
+      <w:r>
+        <w:rPr>
+          <w:rFonts w:ascii="MS Mincho" w:cs="MS Mincho" w:eastAsia="MS Mincho" w:hAnsi="MS Mincho"/>
+          <w:sz w:val="22"/>
+          <w:szCs w:val="22"/>
+        </w:rPr>
+        <w:t xml:space="preserve">(外交部報道官・国営メディア等が担う)と、②政権・指導者・外交場面によって大きく変動する</w:t>
+      </w:r>
+      <w:r>
+        <w:rPr>
+          <w:rFonts w:ascii="Consolas" w:cs="Consolas" w:eastAsia="Consolas" w:hAnsi="Consolas"/>
+          <w:sz w:val="20"/>
+          <w:szCs w:val="20"/>
+        </w:rPr>
+        <w:t xml:space="preserve">首脳レジスター</w:t>
+      </w:r>
+      <w:r>
+        <w:rPr>
+          <w:rFonts w:ascii="MS Mincho" w:cs="MS Mincho" w:eastAsia="MS Mincho" w:hAnsi="MS Mincho"/>
+          <w:sz w:val="22"/>
+          <w:szCs w:val="22"/>
+        </w:rPr>
+        <w:t xml:space="preserve">という、二層構造の記憶レジーム概念として再定式化する。</w:t>
       </w:r>
     </w:p>
     <w:p>
@@ -4770,23 +4831,17 @@
           <w:sz w:val="22"/>
           <w:szCs w:val="22"/>
         </w:rPr>
-        <w:t xml:space="preserve">日本の記憶レジームは、行為主体を一貫して曖昧化しながら(agency_explicit=0%、30件全件で例外なし)、被爆者援護・遺骨収集事業といった制度的対応を前面に押し出す(kingdon_policy=80%)という点で、「政策管理型」と呼ぶにふさわしい。問題を「解決済み」あるいは「粛々と処理すべき事務」として閉じようとする志向が、行為主体の不明確化と制度的対応の突出という二つの指標に同時に表れている。本稿のサンプルは</w:t>
-      </w:r>
-      <w:r>
-        <w:rPr>
-          <w:rFonts w:ascii="Consolas" w:cs="Consolas" w:eastAsia="Consolas" w:hAnsi="Consolas"/>
-          <w:sz w:val="20"/>
-          <w:szCs w:val="20"/>
-        </w:rPr>
-        <w:t xml:space="preserve">speaker_level=HEAD</w:t>
-      </w:r>
-      <w:r>
-        <w:rPr>
-          <w:rFonts w:ascii="MS Mincho" w:cs="MS Mincho" w:eastAsia="MS Mincho" w:hAnsi="MS Mincho"/>
-          <w:sz w:val="22"/>
-          <w:szCs w:val="22"/>
-        </w:rPr>
-        <w:t xml:space="preserve">(首相)のみで構成されているため、日本についてはこの「政策管理型」がより下位の実務レベル(外務省報道官等)でも成立するのかどうかは、本稿の範囲では検証できない――韓国・中国の知見(後述)を踏まえれば、日本についても首相level以外のデータを追加すれば、異なる像が見える可能性は排除できない。</w:t>
+        <w:t xml:space="preserve">実務・広報レジスターは、政権交代をまたいでも高い安定性を示す。韓国の外交部報道官級発話は文在寅・尹錫悦・李在明の三政権を通じて91%(文在寅期2/2、尹錫悦期5/6、李在明期4/4)、中国の外交部報道官・国営メディア級発話は本稿が収集した2020〜2026年の全期間を通じてほぼ100%と、いずれも政権・時期に依存しない定型スクリプトとして機能している。</w:t>
+      </w:r>
+      <w:r>
+        <w:rPr>
+          <w:rFonts w:ascii="MS Mincho" w:cs="MS Mincho" w:eastAsia="MS Mincho" w:hAnsi="MS Mincho"/>
+          <w:b/>
+          <w:bCs/>
+          <w:sz w:val="22"/>
+          <w:szCs w:val="22"/>
+        </w:rPr>
+        <w:t xml:space="preserve">元の3類型のうち韓国=被害政治型、中国=主権・正統性型は、この実務・広報レジスターの記述としては妥当性が高い。</w:t>
       </w:r>
     </w:p>
     <w:p>
@@ -4800,7 +4855,25 @@
           <w:sz w:val="22"/>
           <w:szCs w:val="22"/>
         </w:rPr>
-        <w:t xml:space="preserve">韓国の記憶レジームは、集計値としては行為主体を名指しする比率が相対的に高く(agency_explicit=67〜71%)、「被害政治型」の性格を持つように見える。しかし発話者レベル別に分解すると、この高さを牽引しているのは外交部報道官級の発話(91%、文在寅・尹錫悦・李在明の三政権を通じて一貫して高い)であり、大統領自身の発話(59%)は、文在寅100%→尹錫悦50%→李在明43%という、政権交代に応じた明確な低下傾向を示す。すなわち「被害政治型」という特徴づけは、韓国という国家全体よりも、①政権を問わず一貫して対日名指しを行う外交官僚機構、②政権ごとに関与の度合いが変動する大統領、という二つの異なる主体に分けて理解すべきである。李在明政権(2025〜2026年)の大統領発話は、尹錫悦政権後期よりもさらに関与度が低い――2025年8月の慰安婦記念日メッセージは日本を名指しせず、同年8月の岸田・石破両首相との東京首脳会談でも「歴史に真摯に向き合う」ことを日本に求める発言は一度きりで、他は経済・安全保障協力が中心であった――という点で、必ずしも「回復」の物語では捉えきれない。</w:t>
+        <w:t xml:space="preserve">これに対し首脳レジスターは、国によっても、同一国内の政権によっても大きく異なる。日本の首脳(安倍・菅・岸田・石破)は、本稿がデータを持つ4代を通じて例外なくagency_explicit=0%であり、これは実務レベルのデータを欠くために断定はできないものの、少なくとも観察された範囲では、日本の首脳レジスター自体が高度に均質かつ非名指し的である――</w:t>
+      </w:r>
+      <w:r>
+        <w:rPr>
+          <w:rFonts w:ascii="MS Mincho" w:cs="MS Mincho" w:eastAsia="MS Mincho" w:hAnsi="MS Mincho"/>
+          <w:b/>
+          <w:bCs/>
+          <w:sz w:val="22"/>
+          <w:szCs w:val="22"/>
+        </w:rPr>
+        <w:t xml:space="preserve">元の「政策管理型」は、日本については首脳レジスターの記述としても支持される</w:t>
+      </w:r>
+      <w:r>
+        <w:rPr>
+          <w:rFonts w:ascii="MS Mincho" w:cs="MS Mincho" w:eastAsia="MS Mincho" w:hAnsi="MS Mincho"/>
+          <w:sz w:val="22"/>
+          <w:szCs w:val="22"/>
+        </w:rPr>
+        <w:t xml:space="preserve">、数少ない例である。韓国の首脳レジスターは政権によって大きく異なり、文在寅期100%(4/4、実務レベルの91%をも上回る、本稿で唯一「首脳が実務より対日名指しに積極的」な事例)→尹錫悦期50%→李在明期43%と、時系列的に低下し、次第に日本の政策管理型に近づいていく。中国の首脳(習近平)レジスターは、本稿が新たに収集した2022〜2024年の対日APEC首脳会談3件でいずれもagency_explicit=0%を示し、実務・広報レジスター(ほぼ100%)から大きく乖離して、日本の政策管理型ときわめて近い語り口(「歴史の教訓に学ぶ」)をとる。</w:t>
       </w:r>
     </w:p>
     <w:p>
@@ -4814,7 +4887,40 @@
           <w:sz w:val="22"/>
           <w:szCs w:val="22"/>
         </w:rPr>
-        <w:t xml:space="preserve">中国の記憶レジームは、外交部報道官・国営メディアの発話に限れば、行為主体の明示率がほぼ100%という、最も一貫した「主権・正統性型」の特徴を示す。しかし本稿で新たに追加した習近平自身の発言5件(2025年9月の抗日戦争勝利80周年演説2件、2022〜2024年の対日首脳会談3件)は、この一貫性が習近平個人の対日発言には及ばないことを示す。3件の首脳会談記録はいずれも「歴史の教訓に学ぶ」「歴史を直視する」という抽象的な表現にとどまり、行為主体を明示しない(agency_explicit=0%)――これは日本の政策管理型の語り口にもっとも近い構造である。前回集計時点で提起された「中国の一貫した高い明示率は、外交部報道官という単一ジャンルの人工物にすぎないのではないか」という懸念に対する答えは明確で、その通りである。「主権・正統性型」という特徴づけは、中国の外交部・国営メディアという実務・広報レベルの定型スクリプトを正確に指し示す一方、中国という国家、あるいはその最高指導者の対日姿勢一般に敷衍することはできない。</w:t>
+        <w:t xml:space="preserve">すなわち、</w:t>
+      </w:r>
+      <w:r>
+        <w:rPr>
+          <w:rFonts w:ascii="MS Mincho" w:cs="MS Mincho" w:eastAsia="MS Mincho" w:hAnsi="MS Mincho"/>
+          <w:b/>
+          <w:bCs/>
+          <w:sz w:val="22"/>
+          <w:szCs w:val="22"/>
+        </w:rPr>
+        <w:t xml:space="preserve">「政策管理型」は本来、一国の国民的性格ではなく、対日外交上の特定の局面(儀礼的な国内向け式典、あるいは首脳間の直接対話)で選択される一つのレジスターである</w:t>
+      </w:r>
+      <w:r>
+        <w:rPr>
+          <w:rFonts w:ascii="MS Mincho" w:cs="MS Mincho" w:eastAsia="MS Mincho" w:hAnsi="MS Mincho"/>
+          <w:sz w:val="22"/>
+          <w:szCs w:val="22"/>
+        </w:rPr>
+        <w:t xml:space="preserve">ことが、90件サンプルによって明らかになった。日本の事例が特異なのは、この政策管理型レジスターが(観察されたすべての発話が首脳レベルであるため未確定ではあるものの)首脳レベルにおいて例外なく採用され続けている点であり、韓国・中国は同じレジスターに、政権交代や外交上の局面(定例会見か首脳会談か)に応じて出入りする、より流動的な関係にある。</w:t>
+      </w:r>
+    </w:p>
+    <w:p>
+      <w:pPr>
+        <w:spacing w:after="120" w:before="200"/>
+      </w:pPr>
+      <w:r>
+        <w:rPr>
+          <w:rFonts w:ascii="MS Mincho" w:cs="MS Mincho" w:eastAsia="MS Mincho" w:hAnsi="MS Mincho"/>
+          <w:b/>
+          <w:bCs/>
+          <w:sz w:val="22"/>
+          <w:szCs w:val="22"/>
+        </w:rPr>
+        <w:t xml:space="preserve">(二)含意</w:t>
       </w:r>
     </w:p>
     <w:p>
@@ -4828,7 +4934,7 @@
           <w:sz w:val="22"/>
           <w:szCs w:val="22"/>
         </w:rPr>
-        <w:t xml:space="preserve">以上をまとめると、90件サンプルが明らかにしたのは、日本=政策管理型・韓国=被害政治型・中国=主権・正統性型という3類型そのものの誤りではなく、この3類型が国家単位の固定的な性格ではなく、①発話者の制度的地位(首脳か実務級か)②政権(韓国の場合)③外交の場面(中国の場合、定例会見か首脳会談か)という複数の変数によって条件づけられた、可変的な構造であるという点である。3類型の呼称自体をどう修正・限定して提示するか(例えば「韓国の被害政治型は主に外交官僚機構に、中国の主権・正統性型は主に報道官・国営メディアの言説に妥当する」といった限定を明示的に組み込むか)は、本稿の次の改訂で取り組むべき課題として残しておく。</w:t>
+        <w:t xml:space="preserve">この再定式化は、序論で示した3類型そのものを廃棄するものではない。実務・広報レベルの発話に関する限り、韓国=被害政治型、中国=主権・正統性型という描写は本稿のデータと整合的であり、政権交代をまたいで再現性のある知見である。しかし、この3類型を「国家の記憶レジーム」として無条件に語ることは、国家という単位のなかに存在する制度的階層――とりわけ首脳と実務・広報機構との乖離――を見えなくしてしまう。歴史認識問題が反復的に再燃するメカニズムを説明するうえでも、この階層性は無視できない。すなわち、実務・広報レジスターが安定的に対日名指しの言説を再生産し続ける限り、首脳間でどれほど「未来志向」の政策管理型対話が進んでも、両国関係の緊張は制度的に再供給され続ける――逆に言えば、首脳レベルでの融和(李在明・習近平双方に見られる政策管理型への接近)が実務レベルの言説構造そのものを変えるとは限らない、という非対称性こそが、歴史認識問題の反復性の一因である可能性を、本稿のデータは示唆している。</w:t>
       </w:r>
     </w:p>
     <w:p>
@@ -4857,7 +4963,7 @@
           <w:sz w:val="22"/>
           <w:szCs w:val="22"/>
         </w:rPr>
-        <w:t xml:space="preserve">本稿は、日本・韓国・中国の政府発話91件(主軸90件+歴史的画期1件)の文脈的コーディングに基づき、歴史認識問題の反復的再燃を、謝罪の十分性ではなく各国の記憶レジームの構造差から説明する枠組みを提示した。日本=政策管理型、韓国=被害政治型、中国=主権・正統性型という3類型は、行為主体の明示性、Kingdonの政策・政治次元への布置という二つの量的指標によって、国レベルの集計値としては裏づけられる。ただし発話者の制度的地位(首脳か実務級か)、政権、外交の場面という下位次元まで分解すると、この3類型は国家単位の固定的性格ではなく、韓国では大統領level(政権依存)と外交官僚level(政権を問わず安定)の乖離として、中国では報道官・国営メディアlevel(ほぼ一貫)と最高指導者level(むしろ日本に近い抽象的な語り口)の乖離として現れる、より条件付きの構造であることが明らかになった(7節)。</w:t>
+        <w:t xml:space="preserve">本稿は、日本・韓国・中国の政府発話91件(主軸90件+歴史的画期1件)の文脈的コーディングに基づき、歴史認識問題の反復的再燃を、謝罪の十分性ではなく各国の記憶レジームの構造差から説明する枠組みを提示した。当初提示した3類型――日本=政策管理型、韓国=被害政治型、中国=主権・正統性型――は、行為主体の明示性、Kingdonの政策・政治次元への布置という二つの量的指標によって、国レベルの集計値としては裏づけられる。しかし90件サンプルによる発話者レベル別の分解は、この3類型が国家の固定的性格ではなく、政権交代・外交場面をまたいで安定的な「実務・広報レジスター」(元の3類型が最もよく当てはまる層)と、政権・指導者・場面によって大きく変動する「首脳レジスター」という、二層構造の記憶レジームであることを明らかにした。首脳レジスターにおいては、日本の政策管理型的な語り口(行為主体の非名指し、未来志向)が、韓国(尹錫悦・李在明期)・中国(習近平の対日首脳会談)双方において収斂しつつある一方、実務・広報レジスターはその収斂と無関係に対日名指しの言説を再生産し続けている。本稿はこの実務・首脳間の非対称な乖離こそが、首脳間の「未来志向」対話にもかかわらず歴史認識問題が反復的に再燃する一因であると結論づける。</w:t>
       </w:r>
     </w:p>
     <w:p>
@@ -4871,7 +4977,7 @@
           <w:sz w:val="22"/>
           <w:szCs w:val="22"/>
         </w:rPr>
-        <w:t xml:space="preserve">今後の課題として、以下を挙げる。第一に、3類型の呼称そのものを、上述の発話者レベル別の知見を組み込む形で再定式化すること――本稿では課題として指摘するに留め、着手していない。第二に、日本側の未コーディング候補718件のうち、コンテキストに応じて追加コーディングを進め、政権交代(菅→岸田→石破)に伴う変化をより精確に捉えること。第三に、Internet Archiveへのアクセス回復後、小泉純一郎首相の靖国参拝(2001-2006年)、2005年教科書問題、2015年日韓慰安婦合意、2018年徴用工判決という歴史的画期を追加し、記憶レジームの経時的変化をより長期の視点から検証すること。第四に、各国の原語資料との比較を通じて、本稿が対象とした対外発信用言説と国内向け言説との異同を検討し、記憶レジーム分析を司法判断・市民運動・教育制度・記念施設を含めたより広い制度的射程へと拡張することである。</w:t>
+        <w:t xml:space="preserve">今後の課題として、以下を挙げる。第一に、日本側についても実務・広報レベル(外務省報道官等)の発話を収集し、日本の政策管理型が首脳レジスター固有の現象か、実務レジスターも含めた国全体の傾向かを検証すること――本稿は首脳レベルのデータしか持たず、この点は未確定のまま残されている。第二に、日本側の未コーディング候補718件のうち、コンテキストに応じて追加コーディングを進め、政権交代(菅→岸田→石破)に伴う変化をより精確に捉えること。第三に、Internet Archiveへのアクセス回復後、小泉純一郎首相の靖国参拝(2001-2006年)、2005年教科書問題、2015年日韓慰安婦合意、2018年徴用工判決という歴史的画期を追加し、実務・首脳両レジスターの経時的変化をより長期の視点から検証すること。第四に、各国の原語資料との比較を通じて、本稿が対象とした対外発信用言説と国内向け言説との異同を検討し、記憶レジーム分析を司法判断・市民運動・教育制度・記念施設を含めたより広い制度的射程へと拡張することである。</w:t>
       </w:r>
     </w:p>
     <w:p>
@@ -5098,7 +5204,7 @@
           <w:sz w:val="22"/>
           <w:szCs w:val="22"/>
         </w:rPr>
-        <w:t xml:space="preserve">The paper concludes that the recurrence of historical recognition disputes in East Asia is not simply a matter of insufficiently sincere apologies, but of how each country's memory regime differently links the problem, policy, and politics dimensions of the issue. It further argues that these memory regimes are not fixed national traits but are conditioned by speaker level, administration, and diplomatic occasion — a qualification that should be built into the three-type typology itself in future revisions, rather than treated as a caveat to an otherwise country-level claim.</w:t>
+        <w:t xml:space="preserve">On this basis, the paper reformulates the three-type typology itself: rather than three fixed national characters, each type is better understood as a register — a bureaucratic/media register, which the "victim-politics" and "sovereignty-legitimacy" labels most accurately describe, and a head-of-state register, into which Japan's "policy-management" style extends without exception across four administrations while South Korea's and China's heads of state and government move in and out of it depending on the leader and the diplomatic occasion. The paper concludes that the recurrence of historical recognition disputes in East Asia is not simply a matter of insufficiently sincere apologies, but of an asymmetry between these two registers: however far head-of-state dialogue converges toward a policy-management style, as it increasingly has under South Korea's Lee and China's Xi, the bureaucratic register continues to reproduce explicit, actor-naming discourse largely undisturbed — and it is this persistent gap between the two registers, rather than either alone, that keeps the underlying disputes structurally available for renewed diplomatic friction.</w:t>
       </w:r>
     </w:p>
     <w:p>
@@ -5163,7 +5269,7 @@
           <w:sz w:val="22"/>
           <w:szCs w:val="22"/>
         </w:rPr>
-        <w:t xml:space="preserve">本稿はKingdonの政策の窓モデルを補助線として、日中韓の政府首脳・報道官・国営メディアによる公式英語発話91件(2020〜2026年の主軸90件、日中韓各30件+1995年の村山談話1件)を全文読解し、争点類型、発話者レベル、Kingdonの問題・政策・政治の三次元、謝罪関連語彙(謝罪・説明・悔恨・反省・救済・赦し)、行為主体の明示性についてコーディングした。国レベルで集計すると、行為主体を明示する発話の比率は、日本0%、韓国71%(日本に一切言及しない2件を除く)、中国87%と顕著に異なり、この差異は三つの異なる記憶レジーム類型に対応する。すなわち、行為主体を一貫して曖昧化しながら被爆者援護・遺骨収集事業等の制度的対応を前面に出す日本の「政策管理型」、日本を名指しする頻度が相対的に高く国内政治・外交双方の資源として問題を活性化させる韓国の「被害政治型」、そして大半の発話が行為主体を明示しKingdonの政治次元に該当する、定型的スクリプトを反映した中国の「主権・正統性型」である。</w:t>
+        <w:t xml:space="preserve">本稿はKingdonの政策の窓モデルを補助線として、日中韓の政府首脳・報道官・国営メディアによる公式英語発話91件(2020〜2026年の主軸90件、日中韓各30件+1995年の村山談話1件)を全文読解し、争点類型、発話者レベル、Kingdonの問題・政策・政治の三次元、謝罪関連語彙(謝罪・説明・悔恨・反省・救済・赦し)、行為主体の明示性についてコーディングした。国レベルで集計すると、行為主体を明示する発話の比率は、日本0%、韓国71%(日本に一切言及しない2件を除く)、中国87%と顕著に異なり、この差異は当初、三つの異なる記憶レジーム類型に対応するように見えた。すなわち、行為主体を一貫して曖昧化しながら被爆者援護・遺骨収集事業等の制度的対応を前面に出す日本の「政策管理型」、日本を名指しする頻度が相対的に高く国内政治・外交双方の資源として問題を活性化させる韓国の「被害政治型」、そして大半の発話が行為主体を明示しKingdonの政治次元に該当する、定型的スクリプトを反映した中国の「主権・正統性型」である。</w:t>
       </w:r>
     </w:p>
     <w:p>
@@ -5193,7 +5299,7 @@
           <w:sz w:val="22"/>
           <w:szCs w:val="22"/>
         </w:rPr>
-        <w:t xml:space="preserve">本稿は、東アジアにおける歴史認識問題の反復的再燃が、単なる謝罪の不誠実さの問題ではなく、各国の記憶レジームが問題・政策・政治の三次元をいかに異なる形で結びつけているかという構造の問題であると結論づける。さらに、これらの記憶レジームは固定的な国家特性ではなく、発話者レベル・政権・外交の場面によって条件づけられた可変的な構造であることを示し、この限定を3類型論そのものにどう組み込むかを今後の課題として提示する。</w:t>
+        <w:t xml:space="preserve">以上を踏まえ、本稿は3類型そのものを国家単位の性格描写から発話レジスター単位の記述へと再定式化する。すなわち「被害政治型」「主権・正統性型」は、韓国・中国それぞれの実務・広報レジスター(政権を問わず安定)の記述として妥当性が高く、他方「政策管理型」は一国の国民的性格というより、対日外交の特定の局面――儀礼的な国内向け式典、あるいは首脳間の直接対話――で選択される一つのレジスターである。日本の首脳はこのレジスターを4代を通じ一貫して採用し続けている点で特異だが、韓国(尹錫悦・李在明期)・中国(習近平の対日首脳会談)の首脳もまた、同じレジスターに次第に接近しつつある。本稿は、東アジアにおける歴史認識問題の反復的再燃が、単なる謝罪の不誠実さの問題ではなく、この実務・首脳レジスター間の非対称な乖離――首脳間でどれほど政策管理型の「未来志向」対話が進んでも、実務・広報レジスターが対日名指しの言説を安定的に再生産し続けるという構造――に起因すると結論づける。</w:t>
       </w:r>
     </w:p>
     <w:p>
@@ -5319,6 +5425,91 @@
           <w:szCs w:val="20"/>
         </w:rPr>
         <w:t xml:space="preserve">併せて phase2_plan.md で実施した、ジャンル・発話者レベル・政権別の交絡チェックの再実行結果(90件サンプル)を7節に反映した。最大の変更点は、韓国・中国について新たに speaker_level=OFFICIAL(韓国11件)・speaker_level=HEAD(中国5件、うち3件は今回新規収集の習近平・岸田/石破APEC首脳会談記録)が十分な件数揃ったことで、国レベルの集計値(行為主体明示率)が実際には発話者レベルによって大きく分解されるという知見が得られた点である。具体的には、韓国は外交部報道官level(政権を問わず約91%で安定)と大統領level(文在寅100%→尹錫悦50%→李在明43%と政権依存で低下)に分かれ、中国は報道官・国営メディアlevel(ほぼ100%)と習近平自身の発言level(20%、日本の政策管理型に近い抽象的な語り口)に分かれる。7節ではこの知見を踏まえ、3類型を「国家単位の固定的性格」ではなく「発話者レベル・政権・外交場面によって条件づけられた可変的構造」として再提示し、3類型の呼称自体の再定式化は次の改訂の課題として明示的に残した(ユーザーから「3類型結論の言い方の見直し」自体は本更新の対象外と指示されたため、呼称そのものは変更していない)。</w:t>
+      </w:r>
+    </w:p>
+    <w:p>
+      <w:pPr>
+        <w:shd w:fill="F2F2F2" w:val="clear"/>
+        <w:spacing w:after="160"/>
+        <w:ind w:left="360" w:hanging="200"/>
+      </w:pPr>
+      <w:r>
+        <w:rPr>
+          <w:rFonts w:ascii="MS Mincho" w:cs="MS Mincho" w:eastAsia="MS Mincho" w:hAnsi="MS Mincho"/>
+          <w:i/>
+          <w:iCs/>
+          <w:sz w:val="20"/>
+          <w:szCs w:val="20"/>
+        </w:rPr>
+        <w:t xml:space="preserve">【2026-09-22 さらに追加更新:3類型結論の言い方の見直し】直前の更新で「次の改訂の課題」として明示的に保留した、3類型の呼称自体の再定式化に着手した。要旨(日英・和文再掲とも)、4節(理論枠組み)、7節(考察)、8節(おわりに)を書き換えた。</w:t>
+      </w:r>
+    </w:p>
+    <w:p>
+      <w:pPr>
+        <w:shd w:fill="F2F2F2" w:val="clear"/>
+        <w:spacing w:after="160"/>
+        <w:ind w:left="360" w:hanging="200"/>
+      </w:pPr>
+      <w:r>
+        <w:rPr>
+          <w:rFonts w:ascii="MS Mincho" w:cs="MS Mincho" w:eastAsia="MS Mincho" w:hAnsi="MS Mincho"/>
+          <w:i/>
+          <w:iCs/>
+          <w:sz w:val="20"/>
+          <w:szCs w:val="20"/>
+        </w:rPr>
+        <w:t xml:space="preserve">核となる再定式化:3類型(政策管理型・被害政治型・主権正統性型)を「国家の固定的性格」から「発話レジスター」の記述へ変更した。具体的には、①政権交代をまたいで安定した実務・広報レジスター(韓国の外交部報道官91%、中国の外交部報道官・国営メディア100%――「被害政治型」「主権・正統性型」はこちらの層の記述として妥当性が高い)と、②政権・指導者・外交場面によって大きく変動する首脳レジスター(日本は4代の首相を通じ一貫して0%――「政策管理型」はこの層の記述としても支持される数少ない例である一方、韓国は文在寅100%→尹錫悦50%→李在明43%、中国の習近平は対日APEC首脳会談で20%と、いずれも日本の政策管理型に接近しつつある)、という二層構造として提示し直した。</w:t>
+      </w:r>
+    </w:p>
+    <w:p>
+      <w:pPr>
+        <w:shd w:fill="F2F2F2" w:val="clear"/>
+        <w:spacing w:after="160"/>
+        <w:ind w:left="360" w:hanging="200"/>
+      </w:pPr>
+      <w:r>
+        <w:rPr>
+          <w:rFonts w:ascii="MS Mincho" w:cs="MS Mincho" w:eastAsia="MS Mincho" w:hAnsi="MS Mincho"/>
+          <w:i/>
+          <w:iCs/>
+          <w:sz w:val="20"/>
+          <w:szCs w:val="20"/>
+        </w:rPr>
+        <w:t xml:space="preserve">4節(理論枠組み)には、記憶レジームの構成要素として当初から挙げていた「①公的記憶の主体(誰が語るのか)」を、一国内部の発話レジスターの階層性を捉える分析軸として明示的に再定義する短い段落を追加した――3類型の再定式化が理論枠組みの外挿ではなく、当初の定義に内在していた軸を本格的に展開したものであることを示すため。</w:t>
+      </w:r>
+    </w:p>
+    <w:p>
+      <w:pPr>
+        <w:shd w:fill="F2F2F2" w:val="clear"/>
+        <w:spacing w:after="160"/>
+        <w:ind w:left="360" w:hanging="200"/>
+      </w:pPr>
+      <w:r>
+        <w:rPr>
+          <w:rFonts w:ascii="MS Mincho" w:cs="MS Mincho" w:eastAsia="MS Mincho" w:hAnsi="MS Mincho"/>
+          <w:i/>
+          <w:iCs/>
+          <w:sz w:val="20"/>
+          <w:szCs w:val="20"/>
+        </w:rPr>
+        <w:t xml:space="preserve">8節(おわりに)の結論も、実務・首脳レジスター間の非対称な乖離(首脳間の「未来志向」対話が進んでも実務・広報レジスターは対日名指しの言説を再生産し続ける)を歴史認識問題の反復性の一因として明示的に位置づける形に書き換えた。今後の課題の第一項も、「3類型の再定式化」(完了)から「日本側の実務・広報レベルのデータ収集」(未着手)に差し替えた。</w:t>
+      </w:r>
+    </w:p>
+    <w:p>
+      <w:pPr>
+        <w:shd w:fill="F2F2F2" w:val="clear"/>
+        <w:spacing w:after="160"/>
+        <w:ind w:left="360" w:hanging="200"/>
+      </w:pPr>
+      <w:r>
+        <w:rPr>
+          <w:rFonts w:ascii="MS Mincho" w:cs="MS Mincho" w:eastAsia="MS Mincho" w:hAnsi="MS Mincho"/>
+          <w:i/>
+          <w:iCs/>
+          <w:sz w:val="20"/>
+          <w:szCs w:val="20"/>
+        </w:rPr>
+        <w:t xml:space="preserve">サブタイトルは、この再定式化を踏まえればより的確な表現(例えば「発話レジスターの政治学」といった言い回し)も考えられるが、ご指示通りタイトル自体には手を付けていない――必要であれば別途ご相談されたい。</w:t>
       </w:r>
     </w:p>
     <w:sectPr>

</xml_diff>